<commit_message>
Proofcheck Inn Trouble Italian: MINOR (25 edits)
Co-Authored-By: Claude Opus 5.5 <noreply@anthropic.com>
Claude-Session: https://claude.ai/code/session_012Cm8JxdqzjuttdUSdkQCUg
</commit_message>
<xml_diff>
--- a/translated/corrected/Inn Trouble - ASSEMBLED - FORMATTED_Italian.docx
+++ b/translated/corrected/Inn Trouble - ASSEMBLED - FORMATTED_Italian.docx
@@ -186,7 +186,7 @@
     <w:p/>
     <w:p>
       <w:r>
-        <w:t>La adoravo. Le ragnatele erano comparse con la prima mattina fredda, e ho trascorso moltissimi anni della mia lunga vita in un luogo dove gli unici vicini erano elfi e renne, con un marito che canticchiava tra sé in un laboratorio, perciò non darò mai per scontata una strada piena di zucche. Il signor Kim ne aveva intagliata un'intera fila fuori dall'officina meccanica, ognuna con un berretto di carta da meccanico. La redazione della Gazette aveva uno scheletro alla finestra che leggeva il giornale. Qualcuno, sospettavo fosse Olivia, aveva lavorato ai ferri un cappellino arancione per l'idrante fuori da Yarn Tales.</w:t>
+        <w:t xml:space="preserve">La adoravo. Le ragnatele erano comparse con la prima mattina fredda, e ho trascorso moltissimi anni della mia lunga vita in un luogo dove gli unici vicini erano elfi e renne, con un marito che canticchiava tra sé in un'officina, perciò non darò mai per scontata una strada piena di zucche. Il signor Kim ne aveva intagliata un'intera fila fuori dall'officina meccanica, ognuna con un berretto di carta da meccanico. La redazione della Gazette aveva uno scheletro alla finestra che leggeva il giornale. Qualcuno, sospettavo fosse Olivia, aveva lavorato ai ferri un cappellino arancione per l'idrante fuori da Yarn Tales.</w:t>
       </w:r>
     </w:p>
     <w:p/>
@@ -498,7 +498,7 @@
     <w:p/>
     <w:p>
       <w:r>
-        <w:t xml:space="preserve">E qualcosa non andava nella mia amica, non andava affatto per il verso giusto, abbastanza da mettere le ombre sotto i suoi occhi e quell'espressione circospetta sul suo volto. C'entrava qualcosa una spilla. E uno sconosciuto con un bel sorriso e un taccuino era venuto in un piccolo paese a chiedere proprio di quella.</w:t>
+        <w:t xml:space="preserve">E qualcosa non andava nella mia amica, non andava affatto per il verso giusto, abbastanza da mettere le ombre sotto i suoi occhi e quell'espressione circospetta sul suo volto. C'entrava una spilla. E uno sconosciuto con un bel sorriso e un taccuino era venuto in un piccolo paese a chiedere proprio di quella.</w:t>
       </w:r>
     </w:p>
     <w:p/>
@@ -910,7 +910,7 @@
     <w:p/>
     <w:p>
       <w:r>
-        <w:t>Fu quando mi alzai per lavare le ciotole che notai che Nick si era alzato dal tavolo tre volte mentre parlavo, sgusciando sul retro verso il laboratorio e rientrando. Ogni volta era tornato con della segatura fresca sulla manica e un'espressione sul volto che cercava, senza riuscirci, di nascondere.</w:t>
+        <w:t xml:space="preserve">Fu quando mi alzai per lavare le ciotole che notai che Nick si era alzato dal tavolo tre volte mentre parlavo, sgusciando sul retro verso l'officina e rientrando. Ogni volta era tornato con della segatura fresca sulla manica e un'espressione sul volto che cercava, senza riuscirci, di nascondere.</w:t>
       </w:r>
     </w:p>
     <w:p/>
@@ -952,7 +952,7 @@
     <w:p/>
     <w:p>
       <w:r>
-        <w:t>Quella notte, prima di andare a letto, mi recai alla finestra, come facevo sempre, per osservare il paese che si avviava alla quiete notturna. Il nostro cottage sorgeva un po' discosto dal resto, su per la strada, con il pascolo e la sagoma scura del laboratorio oltre di esso, e poi la cittadina laggiù in basso. Il paese era illuminato.</w:t>
+        <w:t xml:space="preserve">Quella notte, prima di andare a letto, mi recai alla finestra, come facevo sempre, per osservare il paese che si avviava alla quiete notturna. Il nostro cottage sorgeva un po' discosto dal resto, su per la strada, con il recinto e la sagoma scura dell'officina oltre di esso, e poi la cittadina laggiù in basso. Il paese era illuminato.</w:t>
       </w:r>
     </w:p>
     <w:p/>
@@ -1006,7 +1006,7 @@
     <w:p/>
     <w:p>
       <w:r>
-        <w:t>«C'entra qualcosa la tua sorpresa? Qualsiasi cosa ci sia nel laboratorio?»</w:t>
+        <w:t xml:space="preserve">«C'entra qualcosa la tua sorpresa? Qualsiasi cosa ci sia nell'officina?»</w:t>
       </w:r>
     </w:p>
     <w:p/>
@@ -1036,7 +1036,7 @@
     <w:p/>
     <w:p>
       <w:r>
-        <w:t>Restammo lì ancora un po', a contemplare la cittadina dorata, e poi salimmo a coricarci. Rimasi sveglia per un bel pezzo nel buio, tenendo a mente due cose contemporaneamente. Da qualche parte laggiù a Frost Falls una persona era rimasta in piedi tra le scatole dei Blackburn e aveva trovato il modo di stringere la mano attorno alla gola di una brava donna per mezzo milione di dollari. E oltre il pascolo mio marito stava costruendo una sorpresa di cui non voleva pronunciare il nome, mentre le luci si tingevano d'oro da sole e la magia che avevamo portato con noi perlustrava il buio in cerca di un luogo dove posarsi.</w:t>
+        <w:t xml:space="preserve">Restammo lì ancora un po', a contemplare la cittadina dorata, e poi salimmo a coricarci. Rimasi sveglia per un bel pezzo nel buio, tenendo a mente due cose contemporaneamente. Da qualche parte laggiù a Frost Falls una persona era rimasta in piedi tra le scatole dei Blackburn e aveva trovato il modo di stringere la mano attorno alla gola di una brava donna per mezzo milione di dollari. E oltre il recinto mio marito stava costruendo una sorpresa di cui non voleva pronunciare il nome, mentre le luci si tingevano d'oro da sole e la magia che avevamo portato con noi perlustrava il buio in cerca di un luogo dove posarsi.</w:t>
       </w:r>
     </w:p>
     <w:p/>
@@ -2018,7 +2018,7 @@
     <w:p/>
     <w:p>
       <w:r>
-        <w:t>Ci rifletté seriamente, e gliene do atto. Non cercò la risposta facile. «Lo scriverei nel mio rapporto» disse infine. «Dove è finita la cosa, e come. Chiudere la successione. Riscuotere la mia parcella e andarmene.» Alzò le spalle. «Io non sono la legge, signora Claus, e non sono un prete, e di certo non sono la coscienza di una ragazza che a quest'ora sarà morta da un pezzo. Io rintraccio dove sono finite le cose. Cosa le persone abbiano fatto per farcele arrivare, e se avessero ragione o torto a farlo, sono questioni tra loro e qualunque cosa a cui debbano rendere conto, e per di più è una storia vecchia di cent'anni. Non ho alcun interesse a coprire di vergogna una sguattera morta per essere stata povera.» Si fermò, e mi guardò con un briciolo di severità in più sopra le scatole. «Perché me lo chiede in questo modo? Sa qualcosa che io non so, signora Claus?»</w:t>
+        <w:t xml:space="preserve">Ci rifletté seriamente, e gliene do atto. Non cercò la risposta facile. «Lo scriverei nel mio rapporto» disse infine. «Dove è finita la cosa, e come. Chiudere la successione. Riscuotere la mia parcella e andarmene.» Alzò le spalle. «Io non sono la legge, signora Claus, e non sono un prete, e di certo non sono la coscienza di una ragazza che a quest'ora sarà morta da un pezzo. Io rintraccio dove sono finite le cose. Cosa le persone abbiano fatto per farcele arrivare, e se avessero ragione o torto a farlo, sono questioni tra loro e qualunque cosa a cui debbano rendere conto, e per di più è una storia vecchia di cent'anni. Non ho alcun interesse a coprire di vergogna una domestica morta per essere stata povera.» Si fermò, e mi guardò con un briciolo di severità in più sopra le scatole. «Perché me lo chiede in questo modo? Sa qualcosa che io non so, signora Claus?»</w:t>
       </w:r>
     </w:p>
     <w:p/>
@@ -3295,7 +3295,7 @@
     </w:p>
     <w:p>
       <w:r>
-        <w:t>Si levò dorata alle finestre, tutt'a un tratto, sebbene fuori fosse completamente buio e lo fosse da un'ora. Calda e in movimento, si riversò da oltre il pascolo, dall'officina, abbastanza luminosa da proiettare le ombre degli infissi delle finestre sul pavimento della cucina in lunghe sbarre d'oro. Pip si alzò dal focolare. Da fuori, debole e chiaro, giunse un suono simile a moltissimi campanelli lontani, o a un grande fuoco che si assesta tutt'a un tratto.</w:t>
+        <w:t xml:space="preserve">Si levò dorata alle finestre, tutt'a un tratto, sebbene fuori fosse completamente buio e lo fosse da un'ora. Calda e in movimento, si riversò da oltre il recinto, dall'officina, abbastanza luminosa da proiettare le ombre degli infissi delle finestre sul pavimento della cucina in lunghe sbarre d'oro. Pip si alzò dal focolare. Da fuori, debole e chiaro, giunse un suono simile a moltissimi campanelli lontani, o a un grande fuoco che si assesta tutt'a un tratto.</w:t>
       </w:r>
     </w:p>
     <w:p>
@@ -3688,12 +3688,12 @@
         <w:t xml:space="preserve">So come la tua famiglia è entrata in possesso di questa locanda,</w:t>
       </w:r>
       <w:r>
-        <w:t xml:space="preserve"> aveva detto il primo biglietto. Il furto in sé, la spilla, la pietra, il banco dei pegni a Ridgeline, era tutto nelle lettere dei Blackburn, nell'archivio di Theo. Ma l'acquisto della locanda, l'acquisto del 1924, la traccia cartacea di una proprietà che passava di mano in mano, non si trovava in nessuna lettera dei Blackburn. Quello era un registro immobiliare. Un rogito.</w:t>
-      </w:r>
-    </w:p>
-    <w:p>
-      <w:r>
-        <w:t>E il rogito della locanda era custodito in una parete di schedari dietro la scrivania della segretaria del sindaco.</w:t>
+        <w:t xml:space="preserve"> aveva detto il primo biglietto. Il furto in sé, la spilla, la pietra, il banco dei pegni a Ridgeline, era tutto nelle lettere dei Blackburn, nell'archivio di Theo. Ma l'acquisto della locanda, l'acquisto del 1924, la traccia cartacea di una proprietà che passava di mano in mano, non si trovava in nessuna lettera dei Blackburn. Quello era un registro immobiliare. Un atto.</w:t>
+      </w:r>
+    </w:p>
+    <w:p>
+      <w:r>
+        <w:t xml:space="preserve">E l'atto della locanda era custodito in una parete di schedari dietro la scrivania della segretaria del sindaco.</w:t>
       </w:r>
     </w:p>
     <w:p>
@@ -3713,7 +3713,7 @@
     </w:p>
     <w:p>
       <w:r>
-        <w:t>Salii a letto con quel pensiero che mi ronzava dentro, e per la prima volta da giorni c'era qualcosa sotto il terrore, una spinta fredda e limpida. La forma non tornava perché mancava un pezzo, e stando sdraiata lì nel buio seppi di chi fosse quel pezzo. Avevo osservato una donna irrigidirsi a un nome. Avevo visto i cassetti stagliarsi dietro le sue spalle. E l'avevo sentita dirmi, con il rogito del Winter Wonderland Inn nascosto in quei medesimi cassetti, che non leggeva mai i registri che teneva in custodia.</w:t>
+        <w:t xml:space="preserve">Salii a letto con quel pensiero che mi ronzava dentro, e per la prima volta da giorni c'era qualcosa sotto il terrore, una spinta fredda e limpida. La forma non tornava perché mancava un pezzo, e stando sdraiata lì nel buio seppi di chi fosse quel pezzo. Avevo osservato una donna irrigidirsi a un nome. Avevo visto i cassetti stagliarsi dietro le sue spalle. E l'avevo sentita dirmi, con l'atto del Winter Wonderland Inn nascosto in quei medesimi cassetti, che non leggeva mai i registri che teneva in custodia.</w:t>
       </w:r>
     </w:p>
     <w:p>
@@ -3740,7 +3740,7 @@
     <w:p/>
     <w:p>
       <w:r>
-        <w:t xml:space="preserve">La scusa era troppo noiosa per sembrare una bugia, ed era proprio quello il punto. Le dissi che il comitato del festival aveva bisogno della vecchia concessione per il prato, il terreno comunale vero e proprio, per risolvere una piccola diatriba su dove un venditore potesse montare il proprio carretto, e se poteva essere così gentile da tirarmela fuori. Lei sospirò, quel sospiro scocciato di una donna a cui si chiedeva l'ennesima piccola seccatura in una giornata lunga, e andò nella stanza degli archivi in fondo per trovarla.</w:t>
+        <w:t xml:space="preserve">La scusa era troppo noiosa per sembrare una bugia, ed era proprio quello il punto. Le dissi che il comitato del festival aveva bisogno del vecchio atto di proprietà del prato, il terreno comunale vero e proprio, per risolvere una piccola diatriba su dove un venditore potesse montare il proprio carretto, e se poteva essere così gentile da tirarmelo fuori. Lei sospirò, quel sospiro scocciato di una donna a cui si chiedeva l'ennesima piccola seccatura in una giornata lunga, e andò nella stanza degli archivi in fondo per trovarlo.</w:t>
       </w:r>
     </w:p>
     <w:p/>
@@ -3999,7 +3999,7 @@
     </w:p>
     <w:p>
       <w:r>
-        <w:t xml:space="preserve">«Un modo c'è» disse. «C'è quasi sempre un modo, quando le persone coinvolte non sono mostri, e da tutto quello che mi hai raccontato, questi due non sono mostri. Sono un uomo disperato e una donna spaventata che hanno fatto una brutta cosa per motivi che si erano convinti, più che a metà, fossero giusti.» Posò la penna. «Ecco cosa non farò. Non sfonderò una porta a calci e metterò le manette a Theo Hussein in mezzo al festival davanti a tutto il paese. Questo non aiuta nessuno, non è necessario, e non faccio una cosa così crudele quando ne funzionerà una più gentile.» Mi guardò fisso attraverso la scrivania. «Ecco cosa farò invece. Gli darò la possibilità di assumersi le proprie responsabilità, con me nella stanza, in modo che sia legale e documentato. Se ammette liberamente le sue colpe e rimedia, con un risarcimento e una vera resa dei conti, allora c'è spazio perché questa storia finisca in qualcosa di diverso dalla rovina. La chiamiamo giustizia riparativa. Ripara ciò che può invece di rompere solo ciò che è rimasto. Ma funziona solo se è sincero, Jessica. Se mente o cerca di svignarsela dalla porta sul retro, allora si procederà per vie legali, e quella sarà una scelta sua, non mia e non tua.»</w:t>
+        <w:t xml:space="preserve">«Un modo c'è» disse. «C'è quasi sempre un modo, quando le persone coinvolte non sono mostri, e da tutto quello che mi hai raccontato, questi due non sono mostri. Sono un uomo disperato e una donna spaventata che hanno fatto una brutta cosa per motivi che si erano convinti, più che a metà, fossero giusti.» Posò la penna. «Ecco cosa non farò. Non sfonderò una porta a calci per mettere le manette a Theo Hussein in mezzo al festival davanti a tutto il paese. Questo non aiuta nessuno, non è necessario, e non faccio una cosa così crudele quando ne funzionerà una più gentile.» Mi guardò fisso attraverso la scrivania. «Ecco cosa farò invece. Gli darò la possibilità di assumersi le proprie responsabilità, con me nella stanza, in modo che sia legale e documentato. Se ammette liberamente le sue colpe e rimedia, con un risarcimento e una vera resa dei conti, allora c'è spazio perché questa storia finisca in qualcosa di diverso dalla rovina. La chiamiamo giustizia riparativa. Ripara ciò che può invece di rompere solo ciò che è rimasto. Ma funziona solo se è sincero, Jessica. Se mente o cerca di svignarsela dalla porta sul retro, allora si procederà per vie legali, e quella sarà una scelta sua, non mia e non tua.»</w:t>
       </w:r>
     </w:p>
     <w:p>
@@ -4135,12 +4135,12 @@
     </w:p>
     <w:p>
       <w:r>
-        <w:t xml:space="preserve">«Vera» dissi. «Theo aveva le carte del furto. Ma i biglietti sapevano che la locanda era stata comprata con i soldi della spilla, e questo non era mai stato in nessuna lettera dei Blackburn. Questo è un registro catastale. Un atto. E l'atto di questa locanda era fuori dal suo cassetto nel suo cestino di smistamento ieri mattina, maneggiato, sulla scrivania di una donna che mi aveva detto due volte di non leggere mai i registri alle sue spalle.» Mantenni la voce dolce. «Lui aveva le carte del furto. Lei aveva l'atto. E lei aveva le gambe, Vera. Lui non avrebbe potuto attraversare questo paese inosservato per niente al mondo, tutti conoscono Theo, tutti lo fermano. Ma nessuno batte ciglio se la segretaria del sindaco fa un salto alla locanda durante il festival. L'ho incrociata io stessa sui gradini quella mattina, con i suoi pass per il parcheggio. Non avrebbe potuto farlo da solo. Aveva bisogno di qualcuno che potesse muoversi per il paese invisibile. Quella era lei.»</w:t>
-      </w:r>
-    </w:p>
-    <w:p>
-      <w:r>
-        <w:t>Allora lei crollò, tutta in un tratto, come aveva fatto Theo, e ciò che uscì da lei fu miseria, pura e profonda.</w:t>
+        <w:t xml:space="preserve">«Vera» dissi. «Theo aveva le carte del furto. Ma i biglietti sapevano che la locanda era stata comprata con i soldi della spilla, e questo non era mai stato in nessuna lettera dei Blackburn. Questo è un registro immobiliare. Un atto. E l'atto di questa locanda era fuori dal suo cassetto nel suo cestino di smistamento ieri mattina, maneggiato, sulla scrivania di una donna che mi aveva detto due volte di non leggere mai i registri alle sue spalle.» Mantenni la voce dolce. «Lui aveva le carte del furto. Lei aveva l'atto. E lei aveva le gambe, Vera. Lui non avrebbe potuto attraversare questo paese inosservato per niente al mondo, tutti conoscono Theo, tutti lo fermano. Ma nessuno batte ciglio se la segretaria del sindaco fa un salto alla locanda durante il festival. L'ho incrociata io stessa sui gradini quella mattina, con i suoi pass per il parcheggio. Non avrebbe potuto farlo da solo. Aveva bisogno di qualcuno che potesse muoversi per il paese invisibile. Quella era lei.»</w:t>
+      </w:r>
+    </w:p>
+    <w:p>
+      <w:r>
+        <w:t xml:space="preserve">Allora lei crollò, tutta in un tratto, come aveva fatto Theo, e ciò che uscì da lei fu disperazione, pura e profonda.</w:t>
       </w:r>
     </w:p>
     <w:p>
@@ -4683,7 +4683,7 @@
     </w:p>
     <w:p>
       <w:r>
-        <w:t>Nick mi stava aspettando sveglio quando rincasai. Mi prese la mano sulla porta e mi condusse senza proferire parola attraverso il cortile freddo fino al laboratorio, aprendo la porta. Il focolare che aveva costruito brillava al centro della stanza, le pietre di campo rotonde calde e dorate, e la magia fluttuava sopra la grata vuota in cerchi lenti. Ce n'era più di prima.</w:t>
+        <w:t xml:space="preserve">Nick mi stava aspettando sveglio quando rincasai. Mi prese la mano sulla porta e mi condusse senza proferire parola attraverso il cortile freddo fino all'officina, aprendo la porta. Il focolare che aveva costruito brillava al centro della stanza, le pietre di campo rotonde calde e dorate, e la magia fluttuava sopra la grata vuota in cerchi lenti. Ce n'era più di prima.</w:t>
       </w:r>
     </w:p>
     <w:p>
@@ -4718,7 +4718,7 @@
     </w:p>
     <w:p>
       <w:r>
-        <w:t>Entrambi lasciammo la notte dorata per rifugiarci all'interno. Pip ci batté sul tempo alla porta della cucina e se ne stette lì a pretendere di essere fatta entrare al calduccio, e dietro di noi, attraverso il cortile, il focolare continuava a brillare nel laboratorio.</w:t>
+        <w:t xml:space="preserve">Entrambi lasciammo la notte dorata per rifugiarci all'interno. Pip ci batté sul tempo alla porta della cucina e se ne stette lì a pretendere di essere fatta entrare al calduccio, e dietro di noi, attraverso il cortile, il focolare continuava a brillare nell'officina.</w:t>
       </w:r>
     </w:p>
     <w:p/>
@@ -4766,7 +4766,7 @@
     </w:p>
     <w:p>
       <w:r>
-        <w:t>Nuova farina. Nuova acqua. Una bilancia presa in prestito. Ancora acida. Per giovedì Greta se ne stava in piedi nella sua pasticceria a dire a Jessica Claus che le sue mani avevano finalmente dimenticato come si fa.</w:t>
+        <w:t xml:space="preserve">Nuova farina. Nuova acqua. Una bilancia presa in prestito. Ancora acida. Per giovedì Greta se ne stava in piedi nella sua panetteria a dire a Jessica Claus che le sue mani avevano finalmente dimenticato come si fa.</w:t>
       </w:r>
     </w:p>
     <w:p>
@@ -4873,7 +4873,7 @@
     </w:p>
     <w:p>
       <w:r>
-        <w:t xml:space="preserve">Dot rise della sua risata breve e secca dall'altra parte del cerchio, senza distogliere lo sguardo dalla propria ghirlanda, che era già grande una volta e mezza quella di chiunque altra e due volte più fitta. «È a caccia del tuo trucco dal giorno in cui sei entrata. Dava la caccia al mio nel millenovecentoottantaqualcosa.» Dot era robusta, dai capelli grigi, e diceva moltissimo con pochissime parole. Lavorava a ghirlande in quel negozio da decenni. Si vedeva dalle sue mani. Non si fermavano mai e non sbagliavano mai un colpo.</w:t>
+        <w:t xml:space="preserve">Dot rise della sua risata breve e secca dall'altra parte del circolo, senza distogliere lo sguardo dalla propria ghirlanda, che era già grande una volta e mezza quella di chiunque altra e due volte più fitta. «È a caccia del tuo trucco dal giorno in cui sei entrata. Dava la caccia al mio nel millenovecentoottantaqualcosa.» Dot era robusta, dai capelli grigi, e diceva moltissimo con pochissime parole. Lavorava a ghirlande in quel negozio da decenni. Si vedeva dalle sue mani. Non si fermavano mai e non sbagliavano mai un colpo.</w:t>
       </w:r>
     </w:p>
     <w:p>
@@ -4928,7 +4928,7 @@
     </w:p>
     <w:p>
       <w:r>
-        <w:t>«Qualcuno deve pur farlo. Voi tipe non lo farete da sole.» Stava già sollevando il coperchio. Il profumo fuoriuscì e si mescolò all'abete balsamico al centro della stanza, cioccolato e noci pecan e zucchero di canna sovrapposti al pino verde e freddo. Era, pensai, quanto di più simile all'odore della stagione imminente avessi mai sentito. «E ci sono biscotti allo zenzero sul fondo, quindi mi raccomando, non prendete solo i muffin e lasciate i biscotti, Dot, ti ho vista farlo alla Sala della Comunità e non me ne sono dimenticata.»</w:t>
+        <w:t xml:space="preserve">«Qualcuno deve pur farlo. Voi non lo farete di certo da sole.» Stava già sollevando il coperchio. Il profumo fuoriuscì e si mescolò all'abete balsamico al centro della stanza, cioccolato e noci pecan e zucchero di canna sovrapposti al pino verde e freddo. Era, pensai, quanto di più simile all'odore della stagione imminente avessi mai sentito. «E ci sono biscotti allo zenzero sul fondo, quindi mi raccomando, non prendete solo i muffin e lasciate i biscotti, Dot, ti ho vista farlo alla Grange e non me ne sono dimenticata.»</w:t>
       </w:r>
     </w:p>
     <w:p>
@@ -4943,7 +4943,7 @@
     </w:p>
     <w:p>
       <w:r>
-        <w:t xml:space="preserve">Me ne mise in mano uno prima che potessi chiederlo, e uno su Claire, che protestò ma lo prese. Si piantò davanti a Martha finché questa non le promise di mangiare il proprio. E solo quando ne ebbero tutti uno se ne prese uno per sé. Lo mangiò in piedi, guardandoci mentre ce lo gustavamo.</w:t>
+        <w:t xml:space="preserve">Me ne mise in mano uno prima che potessi chiederlo, e lo stesso fece con Claire, che protestò ma lo prese. Si piantò davanti a Martha finché questa non le promise di mangiare il proprio. E solo quando ne ebbero tutti uno se ne prese uno per sé. Lo mangiò in piedi, guardandoci mentre ce lo gustavamo.</w:t>
       </w:r>
     </w:p>
     <w:p>
@@ -5058,7 +5058,7 @@
     </w:p>
     <w:p>
       <w:r>
-        <w:t xml:space="preserve">Perché io conosco la differenza. Vivo ormai da molto tempo accanto alla magia del Natale. Abbastanza a lungo da riconoscerla nelle ossa, chiara come un'orma sul mio stesso gradino. Quello non era un bambino con le dita fredde. La magia era libera a Frost Falls. Era libera dal momento in cui eravamo arrivati, in cerca di una casa. Mio marito ne stava costruendo una. Lenta e paziente nel suo laboratorio, un focolare in cui potersi insediare, e si avvicinava un po' di più al fuoco ogni giorno. Ma non si era ancora stabilita. Era ancora fuori in paese la notte, calda, goffa e del tutto priva di malizia, intenta a compiere quelle piccole cose impossibili che la magia fa quando ha più sentimento che senno. Trasformando le luci del festival da arancioni a dorate. E ora, a quanto pareva, facendo girare nel buio il pupazzo di neve di un bambino per guardare qualunque cosa avesse catturato la sua errabonda attenzione.</w:t>
+        <w:t xml:space="preserve">Perché io conosco la differenza. Vivo ormai da molto tempo accanto alla magia del Natale. Abbastanza a lungo da riconoscerla nelle ossa, chiara come un'orma sul mio stesso gradino. Quello non era un bambino con le dita fredde. La magia era libera a Frost Falls. Era libera dal momento in cui eravamo arrivati, in cerca di una casa. Mio marito ne stava costruendo una. Con lentezza e pazienza nel suo laboratorio, un focolare in cui potersi insediare, e si avvicinava un po' di più al fuoco ogni giorno. Ma non si era ancora stabilita. Era ancora fuori in paese la notte, calda, goffa e del tutto priva di malizia, intenta a compiere quelle piccole cose impossibili che la magia fa quando ha più sentimento che senno. Trasformando le luci del festival da arancioni a dorate. E ora, a quanto pareva, facendo girare nel buio il pupazzo di neve di un bambino per guardare qualunque cosa avesse catturato la sua errabonda attenzione.</w:t>
       </w:r>
     </w:p>
     <w:p>

</xml_diff>

<commit_message>
Full proofcheck Inn Trouble Italian: SIGNIFICANT (59 edits); Inn Trouble full reads complete
Co-Authored-By: Claude Opus 5.5 <noreply@anthropic.com>
Claude-Session: https://claude.ai/code/session_012Cm8JxdqzjuttdUSdkQCUg
</commit_message>
<xml_diff>
--- a/translated/corrected/Inn Trouble - ASSEMBLED - FORMATTED_Italian.docx
+++ b/translated/corrected/Inn Trouble - ASSEMBLED - FORMATTED_Italian.docx
@@ -264,7 +264,7 @@
     <w:p/>
     <w:p>
       <w:r>
-        <w:t>La porta d'ingresso si aprì su una raffica di freddo che fece sfarfallare il fuoco, e una coppia entrò. Tutto in Fiona mutò di colpo. Si raddrizzò. Posò il paniere sulla scrivania. Il sorriso che trovò per i nuovi arrivati era autentico, o abbastanza autentico da far sì che solo chi osservava con attenzione si sarebbe accorto dello sforzo dietro a esso.</w:t>
+        <w:t xml:space="preserve">La porta d'ingresso si aprì su una raffica di freddo che fece sfarfallare il fuoco, e una coppia entrò. Tutto in Fiona mutò di colpo. Si raddrizzò. Posò il paniere sulla scrivania. Il sorriso che trovò per i nuovi arrivati era autentico, o abbastanza autentico da far sì che solo chi osservava con attenzione si accorgesse dello sforzo dietro a esso.</w:t>
       </w:r>
     </w:p>
     <w:p/>
@@ -276,7 +276,7 @@
     <w:p/>
     <w:p>
       <w:r>
-        <w:t>«Molto più che sistemati.» L'uomo aveva i capelli argentati e impeccabili, affabile e senza fretta, uno che chiaramente non aveva mai dovuto attendere il proprio turno. Sua moglie indossava un cachemire color crema e orecchini di perla, no, diamanti, piccoli, che catturavano la luce del fuoco quando voltava la testa e la sparpagliavano sul soffitto. «Speravamo, Fiona, che ci lasciasse tenere la suite un'altra settimana. Ci siamo innamorati di questo posto. Mia moglie dice che non dormiva così bene da anni.»</w:t>
+        <w:t xml:space="preserve">«Molto più che sistemati.» L'uomo aveva i capelli argentati ed era vestito in modo impeccabile, affabile e senza fretta, uno che chiaramente non aveva mai dovuto attendere il proprio turno. Sua moglie indossava un cachemire color crema e orecchini di perla, no, diamanti, piccoli, che catturavano la luce del fuoco quando voltava la testa e la sparpagliavano sul soffitto. «Speravamo, Fiona, che ci lasciasse tenere la suite un'altra settimana. Ci siamo innamorati di questo posto. Mia moglie dice che non dormiva così bene da anni.»</w:t>
       </w:r>
     </w:p>
     <w:p/>
@@ -606,7 +606,7 @@
     </w:p>
     <w:p>
       <w:r>
-        <w:t xml:space="preserve">Era un biglietto. La grafia era deliberatamente brutta, tutta storta e con lettere spezzate, la finta sbadataggine che una persona fa quando si impegna molto a camuffare la propria scrittura. La cifra fu la prima cosa che vidi, perché chiunque l'avesse scritto aveva voluto che quella fosse la prima cosa a saltare all'occhio. Cinquecentomila dollari. E sotto, con quella stessa calligrafia stentata, il resto. </w:t>
+        <w:t xml:space="preserve">Era un biglietto. La grafia era deliberatamente brutta, tutta storta e con lettere spezzate, la goffaggine studiata che una persona mette in atto quando si impegna molto a camuffare la propria scrittura. La cifra fu la prima cosa che vidi, perché chiunque l'avesse scritto aveva voluto che quella fosse la prima cosa a saltare all'occhio. Cinquecentomila dollari. E sotto, con quella stessa calligrafia stentata, il resto. </w:t>
       </w:r>
       <w:r>
         <w:rPr>
@@ -776,7 +776,7 @@
     </w:p>
     <w:p>
       <w:r>
-        <w:t>Quando alla fine Pip ed io uscimmo dalla locanda, il freddo mi tolse il fiato, e rimasi sul portico un momento con una mano premuta piatta sopra il punto in cui il biglietto giaceva piegato contro il mio cappotto. Un furto vecchio di cento anni, e adesso una brava donna non riusciva a dormirci sopra. E solo due posti al mondo da cui il segreto poteva essere uscito, e uno di essi era una scatola che solo Fiona poteva aprire.</w:t>
+        <w:t xml:space="preserve">Quando alla fine Pip ed io uscimmo dalla locanda, il freddo mi tolse il fiato, e rimasi sul portico un momento con una mano premuta piatta sopra il punto in cui il biglietto giaceva piegato contro il mio cappotto. Un furto vecchio di cento anni, e adesso una brava donna non riusciva più a dormire per questo. E solo due posti al mondo da cui il segreto poteva essere uscito, e uno di essi era una scatola che solo Fiona poteva aprire.</w:t>
       </w:r>
     </w:p>
     <w:p>
@@ -868,7 +868,7 @@
     <w:p/>
     <w:p>
       <w:r>
-        <w:t>«So che è vero» risposi. «È questo che me la fa sentire così addosso come un macigno.»</w:t>
+        <w:t xml:space="preserve">«So che è vero» risposi. «È questo che me la fa sentire dentro così gelida.»</w:t>
       </w:r>
     </w:p>
     <w:p/>
@@ -958,7 +958,7 @@
     <w:p/>
     <w:p>
       <w:r>
-        <w:t xml:space="preserve">Le luci del festival lungo i tetti lontani, i fili che gli uomini avevano teso tra i lampioni sul prato verde, ardevano di un color oro anziché arancione, un oro profondo e costante, ogni singolo filo, dal prato fino alla stazione, per quanto la vista potesse spingersi.</w:t>
+        <w:t xml:space="preserve">Le luci del festival lungo i tetti lontani, i fili che gli uomini avevano teso tra i lampioni sul prato, ardevano di un color oro anziché arancione, un oro profondo e costante, ogni singolo filo, dal prato fino alla stazione, per quanto la vista potesse spingersi.</w:t>
       </w:r>
     </w:p>
     <w:p/>
@@ -1082,7 +1082,7 @@
     </w:p>
     <w:p>
       <w:r>
-        <w:t>Aveva un sorriso per chiunque entrasse, uno vero, radioso, spesso con entrambe le mani, e stava raccontando a un uomo alto in parka qualcosa riguardo agli atti che faceva annuire l'uomo, il quale indietreggiava di qualche centimetro. Ma tra un saluto e l'altro, nel mezzo secondo in cui pensava che nessuno lo guardasse, il sorriso gli cadde dal viso come una cosa troppo pesante da reggere, e ciò che c'era sotto mi bloccò sul posto. La sua pelle aveva un tono grigio. C'erano ombre viola sotto gli occhi profonde come lividi. La cravatta era annodata a un quarto di giro dalla perfezione, e i suoi occhiali avevano un'impronta di pollice macchiata su una lente che non aveva più l'attenzione necessaria per notare, figuriamoci per pulire. Si sistemò la cravatta mentre lo guardavo. Se la risistemò un momento dopo, con lo stesso gesto, come se avesse dimenticato di averlo appena fatto.</w:t>
+        <w:t xml:space="preserve">Aveva un sorriso per chiunque entrasse, uno vero, radioso, spesso con entrambe le mani, e stava raccontando a un uomo alto in parka qualcosa riguardo agli atti che faceva annuire l'uomo, il quale indietreggiava di qualche centimetro. Ma tra un saluto e l'altro, nel mezzo secondo in cui pensava che nessuno lo guardasse, il sorriso gli cadde dal viso come una cosa troppo pesante da reggere, e ciò che c'era sotto mi bloccò sul posto. La sua pelle aveva un tono grigio. C'erano ombre viola sotto gli occhi profonde come lividi. La cravatta era annodata a un quarto di giro dalla perfezione, e i suoi occhiali avevano un'impronta di pollice impressa su una lente, che lui non aveva più l'attenzione necessaria per notare, figuriamoci per pulire. Si sistemò la cravatta mentre lo guardavo. Se la risistemò un momento dopo, con lo stesso gesto, come se avesse dimenticato di averlo appena fatto.</w:t>
       </w:r>
     </w:p>
     <w:p>
@@ -1163,7 +1163,7 @@
     </w:p>
     <w:p>
       <w:r>
-        <w:t>Poi Theo batté un cucchiaio contro un bicchiere nella parte anteriore della sala. La folla si voltò e fece silenzio, e lui disse le sue poche parole, che non furono poche. Theo non sapeva dire nulla sul passato in modo conciso. Ringraziò i suoi volontari nominativamente, tutti, inclusa una certa signora Pelletier che aveva evidentemente catalogato fotografie per tre fine settimana consecutivi ed era diventata scarlatta per essere stata menzionata. Ringraziò il paese. Ringraziò, con un nodo alla gola, «chiunque abbia mai conservato una lettera invece di buttarla via, perché in fondo tutta la storia si riduce a questo: le cose che la gente non riusciva a sopportare di buttare via.»</w:t>
+        <w:t xml:space="preserve">Poi Theo batté un cucchiaio contro un bicchiere nella parte anteriore della sala. La folla si voltò e fece silenzio, e lui disse le sue poche parole, che non furono poche. Theo non sapeva dire nulla sul passato in modo conciso. Ringraziò i suoi volontari nominativamente, tutti, inclusa una certa signora Pelletier che aveva evidentemente catalogato fotografie per tre fine settimana consecutivi e che diventò scarlatta nel sentirsi nominare. Ringraziò il paese. Ringraziò, con un nodo alla gola, «chiunque abbia mai conservato una lettera invece di buttarla via, perché in fondo tutta la storia si riduce a questo: le cose che la gente non riusciva a sopportare di buttare via.»</w:t>
       </w:r>
     </w:p>
     <w:p>
@@ -1188,12 +1188,12 @@
     </w:p>
     <w:p>
       <w:r>
-        <w:t xml:space="preserve">Io non risi. Rimasi immobile in mezzo alla stanza calda e ridente e sentii il freddo salirmi dentro, perché le lettere dei Blackburn più interessanti, quelle che avrebbero detto che una spilla era scomparsa e dove era finita, si erano smarrite. E piegata nella tasca interna del mio cappotto c'era un biglietto di ricatto che sapeva esattamente cosa dicevano quelle lettere.</w:t>
-      </w:r>
-    </w:p>
-    <w:p>
-      <w:r>
-        <w:t xml:space="preserve">Girai per la sala dopo quello, lentamente. Ammirai i vecchi atti insieme a Dot, la quale definì l'intera faccenda "un sacco di storie per la posta degli altri" e rimase comunque per un'ora. Lasciai che Theo mi accompagnasse attraverso tre delle teche di vetro, e osservai come le toccava, o meglio come non le toccava, con le dita che fluttuavano sopra il vetro di ciascuna come una mano tesa sulla schiena di un bambino addormentato per sentirlo respirare senza svegliarlo. E per tutto il tempo tenni d'occhio la sala.</w:t>
+        <w:t xml:space="preserve">Io non risi. Rimasi immobile in mezzo alla stanza calda e ridente e sentii il freddo salirmi dentro, perché le lettere dei Blackburn più interessanti, quelle che avrebbero detto che una spilla era scomparsa e dove era finita, si erano smarrite. E piegato nella tasca interna del mio cappotto c'era un biglietto di ricatto che sapeva esattamente cosa dicevano quelle lettere.</w:t>
+      </w:r>
+    </w:p>
+    <w:p>
+      <w:r>
+        <w:t xml:space="preserve">Dopodiché girai per la sala, lentamente. Ammirai i vecchi atti insieme a Dot, la quale definì l'intera faccenda "un sacco di storie per la posta degli altri" e rimase comunque per un'ora. Lasciai che Theo mi accompagnasse attraverso tre delle teche di vetro, e osservai come le toccava, o meglio come non le toccava, con le dita che fluttuavano sopra il vetro di ciascuna come una mano tesa sulla schiena di un bambino addormentato per sentirlo respirare senza svegliarlo. E per tutto il tempo tenni d'occhio la sala.</w:t>
       </w:r>
     </w:p>
     <w:p>
@@ -1354,7 +1354,7 @@
     </w:p>
     <w:p>
       <w:r>
-        <w:t xml:space="preserve">«Sapere che il segreto proveniva dai documenti ti diceva dove metterti» aveva detto Nick. «Non chi.» Molte persone a Frost Falls provavano compassione per Theo. Metà del paese avrebbe pianto nello scoprire quanto fosse grave la situazione. Provare compassione per un uomo, ed essere persino l'uomo più disperato del paese, non equivale a ricattare un'amica per soldi, e non avrei permesso che l'una cosa si mescolasse all'altra nella mia mente senza qualcosa di più solido dell'aritmetica e di una brutta sensazione. Così continuai a sferruzzare, tenni il pugno aperto e mantenni il sospetto leggero, come una brace, pronta a lasciarla cadere.</w:t>
+        <w:t xml:space="preserve">«Sapere che il segreto viene dalle carte ti dice dove metterti» aveva detto Nick. «Non chi.» Molte persone a Frost Falls provavano compassione per Theo. Metà del paese avrebbe pianto nello scoprire quanto fosse grave la situazione. Provare compassione per un uomo, ed essere persino l'uomo più disperato del paese, non equivale a ricattare un'amica per soldi, e non avrei permesso che l'una cosa si mescolasse all'altra nella mia mente senza qualcosa di più solido dell'aritmetica e di una brutta sensazione. Così continuai a sferruzzare, tenni il pugno aperto e mantenni il sospetto leggero, come una brace, pronta a lasciarla cadere.</w:t>
       </w:r>
     </w:p>
     <w:p>
@@ -1505,7 +1505,7 @@
     </w:p>
     <w:p>
       <w:r>
-        <w:t>Ci mettemmo a lavorare insieme dopo quello, noi quattro e il cane, trasportando sedie, facendo la spola con le zucche e discutendo amabilmente su quali fossero troppo morbide per la prima fila.</w:t>
+        <w:t xml:space="preserve">Dopodiché ci mettemmo a lavorare insieme, noi quattro e il cane, trasportando sedie, facendo la spola con le zucche e discutendo amabilmente su quali fossero troppo morbide per la prima fila.</w:t>
       </w:r>
     </w:p>
     <w:p>
@@ -1570,7 +1570,7 @@
     </w:p>
     <w:p>
       <w:r>
-        <w:t>Era tornata alla zucca intagliata che Pip aveva fatto a pezzi, quella con il coperchio strappato e i semi sparsi lungo il fianco nell'erba fredda. Si era immobilizzata sopra di essa, e poi aveva detto, con una voce piccola e prudente che non era paura: «Signora Claus. Guardi.»</w:t>
+        <w:t xml:space="preserve">Era tornata alla zucca intagliata che Pip aveva fatto a pezzi, quella con il coperchio strappato e i semi sparsi lungo il fianco nell'erba fredda. Si era immobilizzata sopra di essa, e poi disse, con una voce piccola e prudente che non era paura: «Signora Claus. Guardi.»</w:t>
       </w:r>
     </w:p>
     <w:p>
@@ -1641,7 +1641,7 @@
     <w:p/>
     <w:p>
       <w:r>
-        <w:t>Tornai alla locanda due giorni dopo, non per investigare, ma perché Fiona aveva bisogno di un'amica più che di una detective in quel momento, ed ero stata così occupata a fare la prima da essermi quasi dimenticata di essere la seconda.</w:t>
+        <w:t xml:space="preserve">Tornai alla locanda due giorni dopo, non per investigare, ma perché Fiona aveva bisogno di un'amica più che di una detective in quel momento, ed ero stata così occupata a fare la detective da essermi quasi dimenticata di essere un'amica.</w:t>
       </w:r>
     </w:p>
     <w:p>
@@ -1743,7 +1743,7 @@
     <w:p/>
     <w:p>
       <w:r>
-        <w:t>Era per quello che ero venuta. Avevo portato il biglietto di ricatto sotto il naso una dozzina di volte da quando Fiona me l'aveva data, cercando di rintracciare il debole sentore metallico che impregnava la carta, e la notte prima, rimasta sveglia ad ascoltare il respiro di Nick, lo avevo trovato. Era proprio quello. Carbone, ferro rovente e un sottofondo minerale, l'intero respiro di una fucina in attività. Ero venuta per averne la certezza.</w:t>
+        <w:t xml:space="preserve">Era per quello che ero venuta. Avevo portato il biglietto di ricatto sotto il naso una dozzina di volte da quando Fiona me l'aveva dato, cercando di rintracciare il debole sentore metallico che impregnava la carta, e la notte prima, rimasta sveglia ad ascoltare il respiro di Nick, lo avevo trovato. Era proprio quello. Carbone, ferro rovente e un sottofondo minerale, l'intero respiro di una fucina in attività. Ero venuta per averne la certezza.</w:t>
       </w:r>
     </w:p>
     <w:p/>
@@ -1928,7 +1928,7 @@
     <w:p/>
     <w:p>
       <w:r>
-        <w:t xml:space="preserve">«Signora Claus! Venga a guardare questo, le piacerà.» Girò verso di me una pagina fragile del registro mentre mi avvicinavo. «Ottocentonovantuno. I Blackburn sborsarono metà dei soldi per la chiesa sul prato. Lo sapeva? Metà. Generosi, i vecchi, quando faceva comodo che si vedesse.» Scosse la testa con quella che sembrava un'ammirazione sincera. «Adoro una famiglia fondatrice. Tutta quell'ambizione spudorata e rapace nella prima generazione, che si inacidisce in rispettabilità entro la terza, e per la quarta si sono dimenticati di aver mai arraffato qualcosa. È la stessa storia in ogni cittadina in cui abbia mai messo piede.»</w:t>
+        <w:t xml:space="preserve">«Signora Claus! Venga a guardare questo, le piacerà.» Girò verso di me una pagina fragile del registro mentre mi avvicinavo. «Milleottocentonovantuno. I Blackburn sborsarono metà dei soldi per la chiesa sul prato. Lo sapeva? Metà. Generosi, i vecchi, quando faceva comodo che si vedesse.» Scosse la testa con quella che sembrava un'ammirazione sincera. «Adoro una famiglia fondatrice. Tutta quell'ambizione spudorata e rapace nella prima generazione, che si inacidisce in rispettabilità entro la terza, e per la quarta si sono dimenticati di aver mai arraffato qualcosa. È la stessa storia in ogni cittadina in cui abbia mai messo piede.»</w:t>
       </w:r>
     </w:p>
     <w:p/>
@@ -1982,7 +1982,7 @@
     <w:p/>
     <w:p>
       <w:r>
-        <w:t>Guardai il biglietto. Neil Carter, c'era scritto, e sotto il nome di uno studio e un numero di telefono con un prefisso di due Stati più in là.</w:t>
+        <w:t xml:space="preserve">Guardai il biglietto da visita. Neil Carter, c'era scritto, e sotto il nome di uno studio e un numero di telefono con un prefisso di due Stati più in là.</w:t>
       </w:r>
     </w:p>
     <w:p/>
@@ -2030,7 +2030,7 @@
     <w:p/>
     <w:p>
       <w:r>
-        <w:t>Rise, una risata vera, e mi lasciò andare. Presi il suo biglietto e recuperai Pip dal punto in cui stava ispezionando lo scaffale inferiore della sezione di storia locale, dopodiché ci incamminammo verso casa rigirando il biglietto tra le dita.</w:t>
+        <w:t xml:space="preserve">Rise, una risata vera, e mi lasciò andare. Presi il suo biglietto da visita e recuperai Pip dal punto in cui stava ispezionando lo scaffale inferiore della sezione di storia locale, dopodiché ci incamminammo verso casa rigirando il biglietto tra le dita.</w:t>
       </w:r>
     </w:p>
     <w:p/>
@@ -2098,7 +2098,7 @@
     </w:p>
     <w:p>
       <w:r>
-        <w:t xml:space="preserve">L'officina brillava attraverso gli interstizi. Quella fu la prima cosa, e mi fermò sul sentiero. Ogni crepa attorno alla porta chiusa a chiave, ogni fessura nelle vecchie pareti di assi, lasciava filtrare una calda luce dorata, lo stesso oro che le luci del festival stavano assumendo, e quando poggiai il palmo della mano contro la porta, il legno era caldo come una pagnotta appena sfornata. Da dentro arrivava il borbottio basso e stonato di Nick e, sotto quel mormorio, un suono a cui non sapevo dare un nome. Un suono simile a un fuoco che si assesta per la notte. Un suono simile a qualcosa di grande che respirava lentamente nel sonno.</w:t>
+        <w:t xml:space="preserve">L'officina brillava attraverso gli interstizi. Quella fu la prima cosa, e mi fermò sul sentiero. Ogni crepa attorno alla porta chiusa a chiave, ogni fessura nelle vecchie pareti di assi, lasciava filtrare una calda luce dorata, lo stesso oro che le luci del festival stavano assumendo, e quando poggiai il palmo della mano contro la porta, il legno era caldo come una pagnotta appena sfornata. Da dentro arrivava il canticchiare basso e stonato di Nick e, sotto quel mormorio, un suono a cui non sapevo dare un nome. Un suono simile a un fuoco che si assesta per la notte. Un suono simile a qualcosa di grande che respirava lentamente nel sonno.</w:t>
       </w:r>
     </w:p>
     <w:p>
@@ -2240,7 +2240,7 @@
         <w:rPr>
           <w:i/>
         </w:rPr>
-        <w:t>ATTI. PERMESSI. REGISTRI FISCALI. ARCHIVI IMMOBILIARI, 1900–1950.</w:t>
+        <w:t xml:space="preserve">ATTI. PERMESSI. REGISTRI FISCALI. REGISTRI IMMOBILIARI, 1900–1950.</w:t>
       </w:r>
       <w:r>
         <w:t xml:space="preserve"> Tutta la memoria di carta di chi possedeva cosa a Frost Falls, un secolo di storia, eretto alle spalle di questa unica donna stanca, e le chiavi di tutto ciò sul mazzo legato al suo fianco.</w:t>
@@ -2273,7 +2273,7 @@
     </w:p>
     <w:p>
       <w:r>
-        <w:t>Mi guardò, e per un solo istante indifeso il suo volto di circostanza e stanco fu qualcos'altro, guardingo, quasi all'angolo, prima che riuscisse a rimettersi la maschera di compostezza addosso come un coperchio su una pentola. «Non saprei nulla dei Blackburn» disse, il che era una cosa strana da dire con un Blackburn seduto a due metri di distanza dietro la sua porta aperta e gli atti dei Blackburn che riempivano i cassetti dietro di lei. «Quello è il dipartimento di Theo. La Società Storica. Io custodisco solo i registri. Non li leggo.» Fece scivolare la lista del festival sul sottomano verso di me. «Ecco. Il circolo è aggiunto. C'era qualcos'altro?»</w:t>
+        <w:t xml:space="preserve">Mi guardò, e per un solo istante indifeso il suo volto di circostanza e stanco fu qualcos'altro, guardingo, quasi all'angolo, prima che riuscisse a rimettersi la maschera di compostezza addosso come un coperchio su una pentola. «Non saprei nulla dei Blackburn» disse, il che era una cosa strana da dire con un Blackburn seduto a due metri di distanza dietro la sua porta aperta e gli atti dei Blackburn che riempivano i cassetti dietro di lei. «Quello è il dipartimento di Theo. La Società Storica. Io custodisco solo i registri. Non li leggo.» Fece scivolare la lista del festival sul sottomano verso di me. «Ecco. Il circolo è stato aggiunto. C'era qualcos'altro?»</w:t>
       </w:r>
     </w:p>
     <w:p>
@@ -2293,7 +2293,7 @@
     </w:p>
     <w:p>
       <w:r>
-        <w:t xml:space="preserve">La gentilezza la raggiunse laddove la domanda aveva fallito. Le spalle le scesero di una frazione, e il suo viso vacillò come sul punto di cedere prima di riprendersi. «È la stagione» disse. «E il sindaco paga uno stipendio comunale per una mole di lavoro da grande città, e alla fine del mese non bastano mai. Non per nessuno quest'anno. Le bollette non si pagano da sole.» Emise una piccola risata logora che non conteneva alcuna allegria. «Le bollette di nessuno si pagano da sole quest'anno, vero, signora Claus.»</w:t>
+        <w:t xml:space="preserve">La gentilezza la raggiunse laddove la domanda aveva fallito. Le spalle le scesero di una frazione, e il suo viso vacillò come sul punto di cedere prima di riprendersi. «È la stagione» disse. «E il sindaco paga uno stipendio comunale per una mole di lavoro da grande città, e alla fine del mese i soldi non bastano mai. Non per nessuno quest'anno. Le bollette non si pagano da sole.» Emise una piccola risata logora che non conteneva alcuna allegria. «Le bollette di nessuno si pagano da sole quest'anno, vero, signora Claus.»</w:t>
       </w:r>
     </w:p>
     <w:p>
@@ -2550,7 +2550,7 @@
     <w:p/>
     <w:p>
       <w:r>
-        <w:t>Tutto era cominciato con la palla di neve.</w:t>
+        <w:t xml:space="preserve">Tutto cominciò con la palla di neve.</w:t>
       </w:r>
     </w:p>
     <w:p/>
@@ -2616,7 +2616,7 @@
     <w:p/>
     <w:p>
       <w:r>
-        <w:t>Un gruppetto di persone si era effettivamente radunato, ed era un gruppo entusiasta. I bambini erano spuntati fuori, com'è inevitabile non appena c'è una renna nei paraggi, e si arrampicavano sul bordo della fontana per accarezzarla, strillando di gioia. Un uomo che non conoscevo stava fotografando Prancer per i suoi nipoti, e il vecchio signor Kim dell'officina aveva portato una sedia pieghevole sul marciapiede per godersi l'intera scenetta con la soddisfazione di chi assiste a un buon spettacolo.</w:t>
+        <w:t xml:space="preserve">Un gruppetto di persone si era effettivamente radunato, ed era un gruppo entusiasta. I bambini erano spuntati fuori, com'è inevitabile non appena c'è una renna nei paraggi, e si arrampicavano sul bordo della fontana per accarezzarla, strillando di gioia. Un uomo che non conoscevo stava fotografando Prancer per i suoi nipoti, e il vecchio signor Kim dell'officina meccanica aveva portato una sedia pieghevole sul marciapiede per godersi l'intera scenetta con la soddisfazione di chi assiste a un buon spettacolo.</w:t>
       </w:r>
     </w:p>
     <w:p/>
@@ -2692,7 +2692,7 @@
     </w:p>
     <w:p>
       <w:r>
-        <w:t>Pip ed io fummo le ultime ad arrivare. Il circolo aveva tirato le sedie vicine alla stufa a legna, con cesti di lana verde scuro sul pavimento tra di loro. Le manopole finite penzolavano a coppie lungo uno spago teso sopra il bancone, come il bucato. Pip andò diritta al barattolo dei bottoni sullo scaffale basso vicino alla cassa, e Olivia lo spostò in cima al bancone senza perdere un punto.</w:t>
+        <w:t xml:space="preserve">Pip ed io fummo le ultime ad arrivare. Il circolo aveva tirato le sedie vicine alla stufa a legna, con cesti di lana del verde della scuola sul pavimento tra di loro. Le manopole finite penzolavano a coppie lungo uno spago teso sopra il bancone, come il bucato. Pip andò diritta al barattolo dei bottoni sullo scaffale basso vicino alla cassa, e Olivia lo spostò in cima al bancone senza perdere un punto.</w:t>
       </w:r>
     </w:p>
     <w:p>
@@ -2792,7 +2792,7 @@
     </w:p>
     <w:p>
       <w:r>
-        <w:t>«Hai il suo biglietto?» disse.</w:t>
+        <w:t xml:space="preserve">«Hai il suo biglietto da visita?» disse.</w:t>
       </w:r>
     </w:p>
     <w:p>
@@ -2832,7 +2832,7 @@
     </w:p>
     <w:p>
       <w:r>
-        <w:t>Pip aveva rinunciato al barattolo dei bottoni. Si era avvicinata e si era sdraiata ai piedi di Martha, contro il lato caldo della stufa. Martha sfilò un piede dalla scarpa e lo appoggiò sulla schiena di Pip.</w:t>
+        <w:t xml:space="preserve">Pip aveva rinunciato al barattolo dei bottoni. Si avvicinò e si sdraiò ai piedi di Martha, contro il lato caldo della stufa. Martha sfilò un piede dalla scarpa e lo appoggiò sulla schiena di Pip.</w:t>
       </w:r>
     </w:p>
     <w:p>
@@ -2863,7 +2863,7 @@
     </w:p>
     <w:p>
       <w:r>
-        <w:t xml:space="preserve">Scrissi i nomi sul lato sinistro del foglio. Sam. Neil. Jamal. Vera. Theo. E in alto scrissi le uniche due domande che contavano, le due a cui un ricattatore doveva saper rispondere con un sì, a tutte e due, o non era lui. </w:t>
+        <w:t xml:space="preserve">Scrissi i nomi sul lato sinistro del foglio. Sam. Neil. Jamal. Vera. Theo. E in alto scrissi le uniche due domande che contavano, le due a cui un ricattatore doveva saper rispondere con un sì, a tutte e due, o non era la persona che cercavo. </w:t>
       </w:r>
       <w:r>
         <w:rPr>
@@ -2894,7 +2894,7 @@
     </w:p>
     <w:p>
       <w:r>
-        <w:t xml:space="preserve">«Sam non ha avuto alcuna occasione. Non ha mai messo piede nell'archivio, dice che la polvere lo fa starnutire, e credo anche a questo. Mi ha detto che le vecchie famiglie sono il campo di Theo, e lo pensava davvero.» Picchiettai sul foglio. «L'odore di fucina lo ha messo sulla lista, e penso che quell'odore sarà esattamente ciò che lo toglierà dalla lista, perché Pip mi dice fin dalla prima notte che il biglietto sa del posto in cui si trova il ferro di Sam, non di Sam. E il ferro di Sam è dappertutto nell'atrio di Fiona. Qualsiasi cosa lasciata in quell'atrio si impregna del profumo del suo fuoco. Qualsiasi cosa.»</w:t>
+        <w:t xml:space="preserve">«Sam non ha avuto alcuna occasione. Non ha mai messo piede nell'archivio, dice che la polvere lo fa starnutire, e credo anche a questo. Mi ha detto che le vecchie famiglie sono il campo di Theo, e lo pensava davvero.» Picchiettai sul foglio. «L'odore di fucina lo ha messo sulla lista, e penso che quell'odore sarà esattamente ciò che lo toglierà dalla lista, perché Pip mi dice fin dalla prima notte che il biglietto sa del posto in cui si trova il ferro di Sam, non di Sam. E il ferro di Sam è dappertutto nella hall di Fiona. Qualsiasi cosa lasciata in quella hall si impregna del profumo del suo fuoco. Qualsiasi cosa.»</w:t>
       </w:r>
     </w:p>
     <w:p>
@@ -2924,7 +2924,7 @@
     </w:p>
     <w:p>
       <w:r>
-        <w:t xml:space="preserve">«Ne restano due.» Guardai il foglio e non avrei voluto farlo. Vera. Theo. I due nomi su cui non avevo alcuna linea da tracciare. «Ed è questo che mi preoccupa. Di tutti quelli su questo foglio, gli unici due che non riesco a scagionare sono quelli che tengono le chiavi dei vecchi documenti del paese. Vera custodisce gli atti e i registri di proprietà, un secolo di chi-possedeva-cosa, l'atto della locanda da qualche parte in mezzo a quelli. Si è irrigidita come un baccalà e mi ha detto che non legge mai le carte che custodisce alle spalle. E Theo.» Mi costrinsi a dirlo lentamente. «Theo vive nell'archivio. Le lettere dei Blackburn erano sotto la sua custodia, nelle sue mani. E le più interessanti, proprio quelle che direbbero che una spilla è sparita e dove è finita, sono quelle che lui si è alzato ad annunciare davanti a tutto il paese che erano andate smarrite.»</w:t>
+        <w:t xml:space="preserve">«Ne restano due.» Guardai il foglio e non avrei voluto farlo. Vera. Theo. I due nomi su cui non avevo alcuna linea da tracciare. «Ed è questo che mi preoccupa. Di tutti quelli su questo foglio, gli unici due che non riesco a scagionare sono quelli che tengono le chiavi dei vecchi documenti del paese. Vera custodisce gli atti e i registri immobiliari, un secolo di chi-possedeva-cosa, l'atto della locanda da qualche parte in mezzo a quelli. Si è irrigidita come un baccalà e mi ha detto che non legge mai le carte che custodisce alle spalle. E Theo.» Mi costrinsi a dirlo lentamente. «Theo vive nell'archivio. Le lettere dei Blackburn erano sotto la sua custodia, nelle sue mani. E le più interessanti, proprio quelle che direbbero che una spilla è sparita e dove è finita, sono quelle che lui si è alzato ad annunciare davanti a tutto il paese che erano andate smarrite.»</w:t>
       </w:r>
     </w:p>
     <w:p>
@@ -2944,7 +2944,7 @@
     </w:p>
     <w:p>
       <w:r>
-        <w:t>«Allora mettila alla prova» disse Nick, «invece di startene qui in cucina a temerla, cosa che non ha mai risolto nulla e mai lo farà. Va' a guardare l'unica cosa che non hai ancora guardato a dovere. Le lettere stesse, o il posto in cui dovrebbero essere.» Allungò una mano sul tavolo posandola calda sopra la mia fredda. «Theo potrebbe aver bisogno di una mano a rimettere in ordine quell'archivio. Va' a offrirgliela. E mentre lo aiuti, scopri una sola cosa. Se le parole di quel biglietto corrispondono alle parole delle lettere che sono sparite. Perché se lo fanno, Jess, allora chiunque abbia scritto il biglietto non si è limitato a leggere i documenti dei Blackburn in generale. Aveva proprio quelle lettere esatte tra le mani. E c'è una lista cortissima di persone a Frost Falls che può dire lo stesso.»</w:t>
+        <w:t xml:space="preserve">«Allora mettila alla prova» disse Nick, «invece di startene qui in cucina a temerla, cosa che non ha mai risolto nulla e mai lo farà. Va' a guardare l'unica cosa che non hai ancora guardato a dovere. Le lettere stesse, o il posto in cui dovrebbero essere.» Allungò una mano sul tavolo posandola calda sopra la mia fredda. «Theo potrebbe aver bisogno di una mano a rimettere in ordine quell'archivio. Va' a offrirgliela. E mentre lo aiuti, scopri una sola cosa. Se le parole di quel biglietto corrispondono alle parole delle lettere che sono sparite. Perché se lo fanno, Jess, allora chiunque abbia scritto il biglietto non si è limitato a leggere le carte dei Blackburn in generale. Aveva proprio quelle lettere esatte tra le mani. E c'è una lista cortissima di persone a Frost Falls che può dire lo stesso.»</w:t>
       </w:r>
     </w:p>
     <w:p>
@@ -3081,7 +3081,7 @@
     </w:p>
     <w:p>
       <w:r>
-        <w:t>«Uno studio vero e proprio» disse, prima ancora che potessi dire pronto. «Uno vecchio, a due stati di distanza, fa esattamente quello che dice il tuo uomo: successioni, patrimoni ed eredi irreperibili per avvocati che hanno più soldi che tempo. E c'è un'eredità Blackburn, Jessica, una vera, in corso. L'ultimo della stirpe di Adelaide Blackburn è morto in città questa primavera, senza figli, senza un testamento degno di questo nome, e ha lasciato un ginepraio pazzesco. Il nostro sindaco appartiene al ramo dei cugini, quelli che hanno preso il naso ma non i soldi. Non c'è dentro. Carter risulta nei libri dello studio come il ricercatore che hanno assunto per sbrogliare la matassa. L'ho saputo da un'impiegata che ha confermato tutto senza rendersi conto nemmeno per un attimo di stare confermando qualcosa. È esattamente, precisamente quello che ti ha detto di essere. Un ficcanaso con la licenza e una nota spese.»</w:t>
+        <w:t xml:space="preserve">«Uno studio vero e proprio» disse, prima ancora che potessi dire pronto. «Uno vecchio, a due stati di distanza, fa esattamente quello che dice quel tuo Carter: successioni, patrimoni ed eredi irreperibili per avvocati che hanno più soldi che tempo. E c'è un'eredità Blackburn, Jessica, una vera, in corso. L'ultimo della stirpe di Adelaide Blackburn è morto in città questa primavera, senza figli, senza un testamento degno di questo nome, e ha lasciato un ginepraio pazzesco. Il nostro sindaco appartiene al ramo dei cugini, quelli che hanno preso il naso ma non i soldi. Non c'è dentro. Carter risulta nei libri dello studio come il ricercatore che hanno assunto per sbrogliare la matassa. L'ho saputo da un'impiegata che ha confermato tutto senza rendersi conto nemmeno per un attimo di stare confermando qualcosa. È esattamente, precisamente quello che ti ha detto di essere. Un ficcanaso con la licenza e una nota spese.»</w:t>
       </w:r>
     </w:p>
     <w:p>
@@ -3161,7 +3161,7 @@
     </w:p>
     <w:p>
       <w:r>
-        <w:t>Lo ringraziai, e lo pensavo dal profondo del cuore. Raccolsi la cartellina e la mia pinguina, che abbandonò la lente d'ingrandimento controvoglia, e uscii nel freddo con l'ultimo dei miei falsi sospetti ormai alle spalle. Ero andata in biblioteca per scagionare Neil Carter. L'avevo scagionato, e me ne ero andata stringendo la cosa che un giorno forse avrebbe permesso a Fiona di camminare libera, qualunque altra cosa fosse successa: la storia vera e completa di dove fosse finita la spilla e del perché.</w:t>
+        <w:t xml:space="preserve">Lo ringraziai, e lo pensavo dal profondo del cuore. Raccolsi la cartellina e il mio pinguino, che abbandonò la lente d'ingrandimento controvoglia, e uscii nel freddo con l'ultimo dei miei falsi sospetti ormai alle spalle. Ero andata in biblioteca per scagionare Neil Carter. L'avevo scagionato, e me ne andai stringendo la cosa che un giorno forse avrebbe permesso a Fiona di camminare libera, qualunque altra cosa fosse successa: la storia vera e completa di dove fosse finita la spilla e del perché.</w:t>
       </w:r>
     </w:p>
     <w:p>
@@ -3192,7 +3192,7 @@
     </w:p>
     <w:p>
       <w:r>
-        <w:t xml:space="preserve">Theo teneva un indice, come deve fare un buon archivista, un lungo e basso cassetto di schede, una scheda per ogni materiale custodito nel luogo, ciascuna recante un breve riassunto nella sua grafia minuta e inclinata di ciò che un determinato fascicolo conteneva. Mi ero offerta di rimettere in ordine una pila di schede che si erano scompaginate. Stavo passando in rassegna le B, Bolle del Panificio, Banda: Sottoscrizioni per il Chiosco, quando arrivai alle schede per i documenti della famiglia Blackburn, e tra queste ne trovai tre contrassegnate in cima a matita rossa: </w:t>
+        <w:t xml:space="preserve">Theo teneva un indice, come deve fare un buon archivista, un lungo e basso cassetto di schede, una scheda per ogni materiale custodito nel luogo, ciascuna recante un breve riassunto nella sua grafia minuta e inclinata di ciò che un determinato fascicolo conteneva. Mi ero offerta di rimettere in ordine una pila di schede che si erano scompaginate. Stavo passando in rassegna le B, Bolle del Panificio, Banda: Sottoscrizioni per il Chiosco, quando arrivai alle schede per le carte della famiglia Blackburn, e tra queste ne trovai tre contrassegnate in cima a matita rossa: </w:t>
       </w:r>
       <w:r>
         <w:rPr>
@@ -3435,7 +3435,7 @@
     <w:p/>
     <w:p>
       <w:r>
-        <w:t>Avevo quell'espressione. Mi viene sempre, a quanto pare. E lo sapevo, o quasi, abbastanza da far sì che il quasi dipendesse solo dal come e dal se da sola. Ma non ero pronta a pronunciare il suo nome a voce alta in quella stanzetta. Dire Theo Hussein a voce alta a Fiona avrebbe fatto rotolare giù da un monte qualcosa che non avrei più potuto richiamare su, e volevo essere assolutamente sicura, e sicura di come farlo con delicatezza, prima di lasciarlo rotolare.</w:t>
+        <w:t xml:space="preserve">Avevo quell'espressione. Mi viene sempre, a quanto pare. E lo sapevo, o quasi, abbastanza da far sì che il quasi dipendesse solo dal come e dal se avesse agito da solo. Ma non ero pronta a pronunciare il suo nome a voce alta in quella stanzetta. Dire Theo Hussein a voce alta a Fiona avrebbe fatto rotolare giù da un monte qualcosa che non avrei più potuto richiamare su, e volevo essere assolutamente sicura, e sicura di come farlo con delicatezza, prima di lasciarlo rotolare.</w:t>
       </w:r>
     </w:p>
     <w:p/>
@@ -3483,7 +3483,7 @@
     <w:p/>
     <w:p>
       <w:r>
-        <w:t>Ma qualcuno poteva. Qualcuno che si muoveva in questo paese con tanta naturalezza che nessuno sguardo si sarebbe mai soffermato su di lui, che poteva fermarsi alla locanda tra la folla del festival, posare una cosa, proseguire e non lasciare alcuna increspatura. Non riuscivo a vedere chi potesse essere. Ma con due biglietti in mano, colsi il primo indizio che la mano che li aveva scritti e la mano che li aveva portati nella hall potevano anche non essere la stessa mano.</w:t>
+        <w:t xml:space="preserve">Ma qualcuno poteva. Qualcuno che si muoveva in questo paese con tanta naturalezza da non attirare mai lo sguardo di nessuno, che poteva fermarsi alla locanda tra la folla del festival, posare una cosa, proseguire e non lasciare alcuna increspatura. Non riuscivo a vedere chi potesse essere. Ma con due biglietti in mano, colsi il primo indizio che la mano che li aveva scritti e la mano che li aveva portati nella hall potevano anche non essere la stessa mano.</w:t>
       </w:r>
     </w:p>
     <w:p/>
@@ -3591,7 +3591,7 @@
     </w:p>
     <w:p>
       <w:r>
-        <w:t>Rimasi in piedi sotto la neve che cadeva, in mezzo ai miei vicini, con Pip appoggiata contro il mio stivale e la mano guantata di Emma che cercava la mia da un lato e quella di Fiona dall'altro. Guardai ogni cosa: le lanterne, la neve, la luce dorata, quel centinaio di volti rivolti al cielo, e compresi, con quella consapevolezza viscerale che precede sempre i pensieri lucidi, quale fosse esattamente la posta in gioco. Non un edificio. Nemmeno un segreto. Questo. Questo radunarsi, questa cittadina che dava il meglio di sé in una giornata fredda e luminosa. Un uomo aveva teso la mano dal buio per chiedere un riscatto su una parte di tutto questo, per trasformarlo in un'arma e in un timore. Trovandomi lì in mezzo alla neve, la mia mente si fece dura e nitida come il freddo. Qualunque cosa mi fosse costata, non gli avrei permesso di mantenere la sua morsa su tutto ciò. L'avrei trascinato alla luce, in un giorno come questo, dove le cose potevano guarire.</w:t>
+        <w:t xml:space="preserve">Rimasi in piedi sotto la neve che cadeva, in mezzo ai miei vicini, con Pip appoggiata contro il mio stivale e la mano guantata di Emma che cercava la mia da un lato e quella di Fiona dall'altro. Guardai ogni cosa: le lanterne, la neve, la luce dorata, quel centinaio di volti rivolti al cielo, e compresi, con quella consapevolezza viscerale che precede sempre i pensieri lucidi, quale fosse esattamente la posta in gioco. Non un edificio. Nemmeno un segreto. Questo. Questo radunarsi, questa cittadina che dava il meglio di sé in una giornata fredda e luminosa. Un uomo aveva teso la mano dal buio per chiedere un riscatto su una parte di tutto questo, per trasformarlo in un'arma e in un timore. Trovandomi lì in mezzo alla neve, la mia mente si fece dura e nitida come il freddo. Qualunque cosa mi fosse costata, non gli avrei permesso di mantenere la sua morsa su tutto ciò. Avrei portato ogni cosa alla luce, in un giorno come questo, dove le cose potevano guarire.</w:t>
       </w:r>
     </w:p>
     <w:p>
@@ -3767,19 +3767,19 @@
     <w:p/>
     <w:p>
       <w:r>
-        <w:t xml:space="preserve">L'atto di proprietà della locanda. Fuori dal suo cassetto. Messo nel cestino delle cose da riarchiviare, maneggiato di recente, sulla scrivania di una donna che mi aveva guardata dritta negli occhi e mi aveva detto, per due volte, che non leggeva mai gli archivi alle sue spalle.</w:t>
-      </w:r>
-    </w:p>
-    <w:p/>
-    <w:p>
-      <w:r>
-        <w:t xml:space="preserve">Aveva letto proprio quello. Lo aveva tirato fuori. L'atto di proprietà della locanda, il documento che registrava l'acquisto del 1924, la metà del segreto che non si trovava in nessuna lettera dei Blackburn e che non c'era mai stata. Era stato tra le mani di Vera Reed, abbastanza recentemente da non averlo ancora messo a posto.</w:t>
-      </w:r>
-    </w:p>
-    <w:p/>
-    <w:p>
-      <w:r>
-        <w:t xml:space="preserve">Quando tornò con una copia dell'atto del prato la ringraziai e feci le mie solite noiose chiacchiere da comitato sui venditori e sulla posizione dei carretti. Poi mi presi tutto il tempo per ripiegarla nella borsa. La osservai, e ora che sapevo cosa stavo guardando riuscii a leggerla chiaramente. Non era una donna dura. Fu questo a colpirmi. Mi ero quasi aspettata, quando finalmente l'avevo vista per intero, di trovare qualcosa di freddo e rapace sotto la stanchezza. Lì non c'era assolutamente nulla di freddo, solo paura ridotta allo stremo, la paura profonda fino alle ossa di una persona che aveva fatto una cosa molto più grande di lei e ci giaceva sveglia dentro ogni notte. Le mani le tremavano mentre raddrizzava il cestino. Due tazze di caffè dimenticate giacevano fredde sulla scrivania. Sembrava colei che Fiona era sembrata per tutta la settimana, come una persona spremuta, solo che era lei a fare la spremitura, e in un certo senso la cosa era ancora più triste.</w:t>
+        <w:t xml:space="preserve">L'atto di proprietà della locanda. Fuori dal suo cassetto. Messo nel cestino delle cose da riarchiviare, maneggiato di recente, sulla scrivania di una donna che mi aveva guardata dritta negli occhi e mi aveva detto, per due volte, che non leggeva mai i registri alle sue spalle.</w:t>
+      </w:r>
+    </w:p>
+    <w:p/>
+    <w:p>
+      <w:r>
+        <w:t xml:space="preserve">Aveva letto proprio quello. Lo aveva tirato fuori. L'atto di proprietà della locanda, il documento che registrava l'acquisto del 1924, la metà del segreto che non si trovava in nessuna lettera dei Blackburn e che non c'era mai stata. Era passato per le mani di Vera Reed, così di recente che lei non l'aveva ancora rimesso a posto.</w:t>
+      </w:r>
+    </w:p>
+    <w:p/>
+    <w:p>
+      <w:r>
+        <w:t xml:space="preserve">Quando tornò con una copia dell'atto del prato la ringraziai e feci le mie solite noiose chiacchiere da comitato sui venditori e sulla posizione dei carretti. Poi mi presi tutto il tempo per ripiegarla nella borsa. La osservai, e ora che sapevo cosa stavo guardando riuscii a leggerla chiaramente. Non era una donna dura. Fu questo a colpirmi. Mi ero quasi aspettata, quando finalmente l'avevo vista per intero, di trovare qualcosa di freddo e rapace sotto la stanchezza. Lì non c'era assolutamente nulla di freddo, solo paura ridotta allo stremo, la paura profonda fino alle ossa di una persona che aveva fatto una cosa molto più grande di lei e ci giaceva sveglia dentro ogni notte. Le mani le tremavano mentre raddrizzava il cestino. Due tazze di caffè dimenticate giacevano fredde sulla scrivania. Aveva l'aspetto che Fiona aveva avuto per tutta la settimana, come una persona spremuta, solo che era lei a fare la spremitura, e in un certo senso la cosa era ancora più triste.</w:t>
       </w:r>
     </w:p>
     <w:p/>
@@ -3809,7 +3809,7 @@
     <w:p/>
     <w:p>
       <w:r>
-        <w:t xml:space="preserve">Theo aveva le carte del furto. Lo aveva trovato nelle lettere dei Blackburn, la spilla, la pietra, il banco dei pegni. Lo aveva catalogato con la sua mano accurata, lo zaffiro al suo cuore, e poi aveva estratto quelle lettere dagli archivi dicendole smarrite. Ma Theo, che affogava, sorvegliato dall'intera cittadina, mai a casa, non avrebbe potuto fare il resto. Non avrebbe potuto confermare che la locanda fosse stata comprata con quei soldi, perché quella prova non si trovava nel suo edificio. E non avrebbe potuto portare i biglietti attraverso il paese e posarne uno su una scrivania affollata in pieno giorno di festival, perché Theo Hussein non poteva camminare lungo Evergreen Avenue inosservato neanche a salvar la pelle.</w:t>
+        <w:t xml:space="preserve">Theo aveva le carte del furto. Lo aveva trovato nelle lettere dei Blackburn, la spilla, la pietra, il banco dei pegni. Lo aveva catalogato con la sua grafia accurata, lo zaffiro al suo cuore, e poi aveva estratto quelle lettere dagli archivi dicendole smarrite. Ma Theo, che affogava, sorvegliato dall'intera cittadina, mai a casa, non avrebbe potuto fare il resto. Non avrebbe potuto confermare che la locanda fosse stata comprata con quei soldi, perché quella prova non si trovava nel suo edificio. E non avrebbe potuto portare i biglietti attraverso il paese e posarne uno su una scrivania affollata in pieno giorno di festival, perché Theo Hussein non poteva camminare lungo Evergreen Avenue inosservato neanche a salvar la pelle.</w:t>
       </w:r>
     </w:p>
     <w:p/>
@@ -3845,7 +3845,7 @@
     <w:p/>
     <w:p>
       <w:r>
-        <w:t>Camminando per il resto della strada verso casa nel freddo, con l'atto del prato nella borsa e i nomi di entrambi pesanti nel petto, potevo percepire la scelta che mi attendeva. Aveva il peso del genere più duro, il genere che non avevo più dovuto fare dal giorno in cui ero scesa dalla cima del mondo.</w:t>
+        <w:t xml:space="preserve">Camminando per il resto della strada verso casa nel freddo, con l'atto del prato nella borsa e i nomi di entrambi pesanti nel petto, potevo percepire la scelta che mi attendeva. Aveva il peso delle scelte più dure, quelle che non avevo più dovuto compiere dal giorno in cui ero scesa dalla cima del mondo.</w:t>
       </w:r>
     </w:p>
     <w:p>
@@ -3892,7 +3892,7 @@
     <w:p/>
     <w:p>
       <w:r>
-        <w:t>E c'era una seconda menzogna nascosta dentro la prima. La via più facile sembrava perdono, e non lo era affatto. Quello che avrei consegnato a Theo e a Vera era un modo per non affrontarla mai, per saltare a piè pari la difficile fase intermedia in cui una persona fa i conti con il male commesso, passando direttamente dal crimine all'assoluzione senza nulla di reale in mezzo. Questo li avrebbe solo aiutati a continuare a nascondersi, dal paese e da se stessi. E se non avessero mai dovuto avvertirne il peso, avrebbero potuto farlo di nuovo. Non avrei salvato l'anima di Theo seppellendo il suo crimine. Gli avrei sottratto l'unica cosa che poteva guarirla, ovvero l'assumersene la responsabilità.</w:t>
+        <w:t xml:space="preserve">E c'era una seconda menzogna nascosta dentro la prima. La via più facile sembrava perdono, e non lo era affatto. Quello che avrei consegnato a Theo e a Vera era un modo per non affrontare mai i fatti, per saltare a piè pari la difficile fase intermedia in cui una persona fa i conti con il male commesso, passando direttamente dal crimine all'assoluzione senza nulla di reale in mezzo. Questo li avrebbe solo aiutati a continuare a nascondersi, dal paese e da se stessi. E se non avessero mai dovuto avvertirne il peso, avrebbero potuto farlo di nuovo. Non avrei salvato l'anima di Theo seppellendo il suo crimine. Gli avrei sottratto l'unica cosa che poteva guarirla, ovvero l'assumersene la responsabilità.</w:t>
       </w:r>
     </w:p>
     <w:p/>
@@ -3916,7 +3916,7 @@
     <w:p/>
     <w:p>
       <w:r>
-        <w:t xml:space="preserve">«Non posso seppellirlo» dissi. «Lo vorrei. Dio sa quanto vorrei andare là stanotte, sussurrare via tutto e lasciare che tutti mantengano la loro vita. Ma se lo faccio, Fiona non smette mai di aver paura, non sul serio. Theo non è mai costretto a diventare un uomo che possa essere perdonato. E il marcio rimane laggiù dentro il muro dove non posso vederlo, a crescere.» Mi premisi i palmi delle mani contro gli occhi. «La cosa gentile e la cosa facile non sono la stessa. Deve emergere alla luce. Tutto quanto. Per bene. Con Noriko Tanaka. Con la legge di mezzo, fatta con delicatezza, fatta con misericordia, ma fatta. Questo è l'unico modo in cui Fiona si libera per sempre di questa storia, e l'unico modo in cui Theo riesce a essere qualcosa di diverso da un uomo con un crimine sepolto sotto le assi del pavimento.»</w:t>
+        <w:t xml:space="preserve">«Non posso seppellirlo» dissi. «Lo vorrei. Dio sa quanto vorrei andare là stanotte, sussurrare via tutto e lasciare che tutti mantengano la loro vita. Ma se lo faccio, Fiona non smette mai di aver paura, non sul serio. Theo non è mai costretto a diventare un uomo che possa essere perdonato. E il marcio rimane laggiù dentro il muro dove non posso vederlo, a crescere.» Mi premisi i palmi delle mani contro gli occhi. «La cosa gentile e la cosa facile non sono la stessa cosa. Deve emergere alla luce. Tutto quanto. Per bene. Con Noriko Tanaka. Con la legge di mezzo, fatta con delicatezza, fatta con misericordia, ma fatta. Questo è l'unico modo in cui Fiona si libera per sempre di questa storia, e l'unico modo in cui Theo riesce a essere qualcosa di diverso da un uomo con un crimine sepolto sotto le assi del pavimento.»</w:t>
       </w:r>
     </w:p>
     <w:p/>
@@ -3928,7 +3928,7 @@
     <w:p/>
     <w:p>
       <w:r>
-        <w:t xml:space="preserve">Eccola lì, l'ultima paura, la più piccola di tutte e la più interamente mia. Ero ancora mezza estranea in quel paese. Chiunque altro si conosceva fin da quando erano bambini che imparavano a camminare sugli stessi marciapiedi, e io mi ero guadagnata il mio posto un centimetro alla volta, uno sformato qui, la ricerca di un cane là, una sedia tirata vicino al circolo di maglia. Trascinare Theo Hussein alla luce avrebbe potuto costarmi parte di quel centimetro conquistato a fatica. La gente non ama sempre chi dice la dura e nuda verità. Avrei potuto fare esattamente la cosa giusta ed essere, da allora in poi, l'estranea che aveva distrutto un brav'uomo e portato il lutto in paese.</w:t>
+        <w:t xml:space="preserve">Eccola lì, l'ultima paura, la più piccola di tutte e la più interamente mia. Ero ancora mezza estranea in quel paese. Tutti gli altri si conoscevano fin da quando erano bambini che imparavano a camminare sugli stessi marciapiedi, e io mi ero guadagnata il mio posto un centimetro alla volta, uno sformato qui, la ricerca di un cane là, una sedia tirata vicino al circolo di maglia. Trascinare Theo Hussein alla luce avrebbe potuto costarmi parte di quel centimetro conquistato a fatica. La gente non ama sempre chi dice la dura e nuda verità. Avrei potuto fare esattamente la cosa giusta ed essere, da allora in poi, l'estranea che aveva distrutto un brav'uomo e portato il lutto in paese.</w:t>
       </w:r>
     </w:p>
     <w:p/>
@@ -3999,7 +3999,7 @@
     </w:p>
     <w:p>
       <w:r>
-        <w:t xml:space="preserve">«Un modo c'è» disse. «C'è quasi sempre un modo, quando le persone coinvolte non sono mostri, e da tutto quello che mi hai raccontato, questi due non sono mostri. Sono un uomo disperato e una donna spaventata che hanno fatto una brutta cosa per motivi che si erano convinti, più che a metà, fossero giusti.» Posò la penna. «Ecco cosa non farò. Non sfonderò una porta a calci per mettere le manette a Theo Hussein in mezzo al festival davanti a tutto il paese. Questo non aiuta nessuno, non è necessario, e non faccio una cosa così crudele quando ne funzionerà una più gentile.» Mi guardò fisso attraverso la scrivania. «Ecco cosa farò invece. Gli darò la possibilità di assumersi le proprie responsabilità, con me nella stanza, in modo che sia legale e documentato. Se ammette liberamente le sue colpe e rimedia, con un risarcimento e una vera resa dei conti, allora c'è spazio perché questa storia finisca in qualcosa di diverso dalla rovina. La chiamiamo giustizia riparativa. Ripara ciò che può invece di rompere solo ciò che è rimasto. Ma funziona solo se è sincero, Jessica. Se mente o cerca di svignarsela dalla porta sul retro, allora si procederà per vie legali, e quella sarà una scelta sua, non mia e non tua.»</w:t>
+        <w:t xml:space="preserve">«Un modo c'è» disse. «C'è quasi sempre un modo, quando le persone coinvolte non sono mostri, e da tutto quello che mi hai raccontato, questi due non sono mostri. Sono un uomo disperato e una donna spaventata che hanno fatto una brutta cosa per motivi che si erano convinti, più che a metà, fossero giusti.» Posò la penna. «Ecco cosa non farò. Non sfonderò una porta a calci per mettere le manette a Theo Hussein in mezzo al festival davanti a tutto il paese. Questo non aiuta nessuno, non è necessario, e non faccio una cosa così crudele quando ne funzionerà una più gentile.» Mi guardò fisso attraverso la scrivania. «Ecco cosa farò invece. Gli darò la possibilità di assumersi le proprie responsabilità, con me nella stanza, in modo che sia legale e documentato. Se ammette liberamente le sue colpe e rimedia, con un risarcimento e una vera resa dei conti, allora c'è spazio perché questa storia finisca in qualcosa di diverso dalla rovina. La chiamiamo giustizia riparativa. Ripara ciò che può invece di rompere solo ciò che è rimasto. Ma funziona solo se è sincero, Jessica. Se mente o cerca di svignarsela dalla porta sul retro, allora si andrà per la via dura, e quella sarà una scelta sua, non mia e non tua.»</w:t>
       </w:r>
     </w:p>
     <w:p>
@@ -4014,7 +4014,7 @@
     </w:p>
     <w:p>
       <w:r>
-        <w:t>Era giusto. Era molto meglio della trappola che avevo mezza immaginato, una notte di contanti civetta, fiato sospeso e la mano di qualcuno che usciva dal buio. Non ci sarebbe stato alcun buio in questa storia. Lo avremmo fatto in una stanza calda alla luce del pomeriggio, con la misericordia nelle nostre mani e il capo della polizia al nostro fianco, e avremmo dato a un brav'uomo caduto in errore la semplice dignità di affrontare la situazione a testa alta, con le sue stesse gambe.</w:t>
+        <w:t xml:space="preserve">Era giusto. Era molto meglio della trappola che avevo in parte immaginato, una notte di contanti civetta, fiato sospeso e la mano di qualcuno che usciva dal buio. Non ci sarebbe stato alcun buio in questa storia. Lo avremmo fatto in una stanza calda alla luce del pomeriggio, con la misericordia nelle nostre mani e il capo della polizia al nostro fianco, e avremmo dato a un brav'uomo caduto in errore la semplice dignità di affrontare la situazione a testa alta, con le sue stesse gambe.</w:t>
       </w:r>
     </w:p>
     <w:p>
@@ -4120,7 +4120,7 @@
     </w:p>
     <w:p>
       <w:r>
-        <w:t xml:space="preserve">«Dissi a me stesso che non era un vero furto» disse. «Non nei confronti di Fiona. Dissi a me stesso che la locanda era stata acquistata con denaro rubato fin dall'inizio, quindi riprenderne un po' non era un furto, era, non so, la storia che correggeva se stessa, un conto che finalmente giungeva a scadenza. Sono così bravo a far significare al passato qualunque cosa io abbia bisogno che significhi. È tutta la mia formazione, fare in modo che il passato abbia un senso.» Si premette i pugni contro gli occhi come un bambino. «Il tetto sta cedendo. La caldaia sta morendo. Cent'anni di memoria di questo paese, ogni lettera, ogni fotografia e ogni atto, tutto che va in rovina, e ogni porta onesta a cui ho bussato chiusa in faccia, il sindaco, i fondi, le fondazioni, nessuna esclusa. E poi ho trovato quelle lettere, ed eccoli lì, mezzo milione di dollari, semplicemente seduti lì nel passato, e ho pensato: posso salvarla. Posso salvare tutto, ogni singolo frammento, e nessuno si farà davvero male, perché il denaro era sporco in origine.» Sollevò lo sguardo, addolorato. «E poi ho visto cosa stava facendo a lei. A Fiona. L'ho vista farsi grigia in volto. E ho detto a me stesso che avrei smesso, e non ho smesso, perché a quel punto ero già dentro fino al collo, e una volta che l'avevo fatto, mi dissi che un'altra volta non avrebbe fatto differenza.» Si voltò verso Fiona e la sua voce si spezzò. «Mi dispiace così tanto. Mi dispiace tanto, Fiona. Mi sono perso da qualche parte in tutto questo. Amo così tanto la storia di questo paese da aver dimenticato che il paese è fatto di persone vive.»</w:t>
+        <w:t xml:space="preserve">«Mi sono detto che non era un vero furto» disse. «Non nei confronti di Fiona. Mi sono detto che la locanda era stata acquistata con denaro rubato fin dall'inizio, quindi riprenderne un po' non era un furto, era, non so, la storia che correggeva se stessa, un conto che finalmente giungeva a scadenza. Sono così bravo a far significare al passato qualunque cosa io abbia bisogno che significhi. È tutta la mia formazione, fare in modo che il passato abbia un senso.» Si premette i pugni contro gli occhi come un bambino. «Il tetto sta cedendo. La caldaia sta morendo. Cent'anni di memoria di questo paese, ogni lettera, ogni fotografia e ogni atto, tutto che va in rovina, e ogni porta onesta a cui ho bussato chiusa in faccia, il sindaco, i fondi, le fondazioni, nessuna esclusa. E poi ho trovato quelle lettere, ed eccoli lì, mezzo milione di dollari, semplicemente seduti lì nel passato, e ho pensato: posso salvarla. Posso salvare tutto, ogni singolo frammento, e nessuno si farà davvero male, perché il denaro era sporco in origine.» Sollevò lo sguardo, addolorato. «E poi ho visto cosa stava facendo a lei. A Fiona. L'ho vista farsi grigia in volto. E ho detto a me stesso che avrei smesso, e non ho smesso, perché a quel punto ero già dentro fino al collo, e una volta che l'avevo fatto, mi sono detto che un'altra volta non avrebbe fatto differenza.» Si voltò verso Fiona e la sua voce si spezzò. «Mi dispiace così tanto. Mi dispiace tanto, Fiona. Mi sono perso da qualche parte in tutto questo. Amo così tanto la storia di questo paese da aver dimenticato che il paese è fatto di persone vive.»</w:t>
       </w:r>
     </w:p>
     <w:p>
@@ -4145,7 +4145,7 @@
     </w:p>
     <w:p>
       <w:r>
-        <w:t xml:space="preserve">«È venuto da me» disse. «Settimane fa. Fuori di sé dalla disperazione, a parlare della Società, di come avesse trovato questa cosa e non potesse farcela da solo. E io avrei dovuto dire di no. So che avrei dovuto dire di no, lo sapevo già allora.» Si dondolò leggermente, con le braccia strette intorno al corpo. «Ma sono così indietro con i pagamenti, signora Claus. Il sindaco mi paga una miseria e mi sfrutta fino al midollo, e ho debiti che non immaginereste, di quelli che non ti fanno dormire, e Theo ha detto che erano soldi rubati in origine, a una famiglia ricca cento anni fa, e che avrebbero salvato la Società, e che una parte sarebbe venuta a me, e che finalmente mi sarei tolta dai guai. Ha fatto sembrare la cosa quasi nobile. Lui è bravo in questo, a far sembrare una cosa storia invece di un crimine. E volevo liberarmi da quella situazione così disperatamente che ho permesso che la facesse sembrare così, perché volevo crederci.» Guardò Fiona, distrutta. «Non ho mai pensato a te come a una persona. Questa è la parte peggiore, è la cosa che mi porterò dentro. Ho pensato solo ai soldi e al non dover più passare notti in bianco. Mi dispiace. Mi dispiace tanto, Fiona.»</w:t>
+        <w:t xml:space="preserve">«È venuto da me» disse. «Settimane fa. Fuori di sé dalla disperazione, a parlare della Società, di come avesse trovato questa cosa e non potesse farcela da solo. E io avrei dovuto dire di no. So che avrei dovuto dire di no, lo sapevo già allora.» Si dondolò leggermente, con le braccia strette intorno al corpo. «Ma sono così indietro con i pagamenti, signora Claus. Il sindaco mi paga una miseria e mi sfrutta fino al midollo, e ho debiti che non immaginerebbe, di quelli che non ti fanno dormire, e Theo ha detto che erano soldi rubati in origine, a una famiglia ricca cento anni fa, e che avrebbero salvato la Società, e che una parte sarebbe venuta a me, e che finalmente mi sarei tolta dai guai. Ha fatto sembrare la cosa quasi nobile. Lui è bravo in questo, a far sembrare una cosa storia invece di un crimine. E volevo liberarmi da quella situazione così disperatamente che ho permesso che la facesse sembrare così, perché volevo crederci.» Guardò Fiona, distrutta. «Non ho mai pensato a te come a una persona. Questa è la parte peggiore, è la cosa che mi porterò dentro. Ho pensato solo ai soldi e al non dover più passare notti in bianco. Mi dispiace. Mi dispiace tanto, Fiona.»</w:t>
       </w:r>
     </w:p>
     <w:p>
@@ -4160,7 +4160,7 @@
     </w:p>
     <w:p>
       <w:r>
-        <w:t>«Va bene» disse. «Avete ammesso entrambi, liberamente, e questo conta più di quanto voi due possiate ancora comprendere. Ora parliamo di ciò che viene dopo. Perché ammettere una cosa è l'inizio per porvi rimedio. Non è la fine. La fine è molto più lunga, e comincia domani.»</w:t>
+        <w:t xml:space="preserve">«Va bene» disse. «Avete ammesso tutto entrambi, liberamente, e questo conta più di quanto voi due possiate ancora comprendere. Ora parliamo di ciò che viene dopo. Perché ammettere una cosa è l'inizio per porvi rimedio. Non è la fine. La fine è molto più lunga, e comincia domani.»</w:t>
       </w:r>
     </w:p>
     <w:p>
@@ -4272,7 +4272,7 @@
     </w:p>
     <w:p>
       <w:r>
-        <w:t>Lo avevano saputo, naturalmente. A Frost Falls una notizia del genere non restava segreta più di una mattina. I raffinati e gentili Worthington avevano intuito, tra il chiacchiericcio del festival e il silenzio ovattato della locanda, che la Società Storica si trovava in grave difficoltà e che quei problemi avevano spinto un uomo per bene sulla cattiva strada. Il signor Worthington mi trovò sul portico della locanda durante la loro ultima mattina, con sua moglie accanto avvolta nel suo cashmere color crema e con il cappotto buono sopra il braccio, e arrivò subito al dunque con la disinvoltura di chi non aveva mai avuto problemi a parlare di denaro.</w:t>
+        <w:t xml:space="preserve">Lo avevano saputo, naturalmente. A Frost Falls una notizia del genere non restava segreta più di una mattina. I raffinati e gentili Worthington avevano intuito, tra il chiacchiericcio del festival e il silenzio ovattato della locanda, che la Società Storica si trovava in grave difficoltà e che quei problemi avevano spinto un uomo per bene sulla cattiva strada. Il signor Worthington mi trovò sul portico della locanda durante la loro ultima mattina, con sua moglie accanto avvolta nel suo cachemire color crema e con il cappotto buono sopra il braccio, e arrivò subito al dunque con la disinvoltura di chi non aveva mai avuto problemi a parlare di denaro.</w:t>
       </w:r>
     </w:p>
     <w:p>
@@ -4317,7 +4317,7 @@
     </w:p>
     <w:p>
       <w:r>
-        <w:t>«Sto rifiutando un salvataggio» dissi. «Non la sua gentilezza, mai quella. E questo è ciò che le chiederei in cambio, se lo pensa davvero. Lasci che sia il paese a provare prima. Lasci che organizzi le sue vendite di torte e le sue imbarazzanti piccole lotterie e scopra da solo cosa è disposto a fare per la propria memoria. E poi, se non dovesse farcela, se Frost Falls facesse tutto il possibile e ancora non riuscisse ad arrivare alla meta, torni. Sia l'ultima pietra del ponte, non l'intero ponte. Lasci che sia il paese a costruirne la maggior parte. In questo modo quel ponte sarà loro.»</w:t>
+        <w:t xml:space="preserve">«Sto rifiutando un salvataggio» dissi. «Non la sua gentilezza, mai quella. E questo è ciò che le chiederei invece, se lo pensa davvero. Lasci che sia il paese a provare prima. Lasci che organizzi le sue vendite di torte e le sue imbarazzanti piccole lotterie e scopra da solo cosa è disposto a fare per la propria memoria. E poi, se non dovesse farcela, se Frost Falls facesse tutto il possibile e ancora non riuscisse ad arrivare alla meta, torni. Sia l'ultima pietra del ponte, non l'intero ponte. Lasci che sia il paese a costruirne la maggior parte. In questo modo quel ponte sarà loro.»</w:t>
       </w:r>
     </w:p>
     <w:p>
@@ -4387,7 +4387,7 @@
     <w:p/>
     <w:p>
       <w:r>
-        <w:t xml:space="preserve">E Fiona lo fece. Lasciò che Claire la mettesse per iscritto sulla Gazette, la versione vera e completa, con i documenti di Neil allegati. Non la versione da pettegolezzo, con il suo cattivo bello netto e il suo delitto bello netto, ma quella vera. Constance Okafor, una sguattera diciannovenne nell'inverno del 1924, non pagata per mesi, con la madre morente a tre isolati di distanza e senza soldi per un medico, a cui era stato detto di essere grata per un tetto mentre spolverava, ogni singolo giorno, una spilla che valeva più di quanto avrebbe guadagnato in tre vite intere. Una ragazza disperata che aveva preso l'unica cosa che riusciva a raggiungere, da una famiglia che l'aveva derubata per prima, e l'aveva trasformata in cento anni di accoglienza sincera per i viaggiatori che passavano da Frost Falls nel freddo.</w:t>
+        <w:t xml:space="preserve">E Fiona lo fece. Lasciò che Claire la mettesse per iscritto sulla Gazette, la versione vera e completa, con i documenti di Neil allegati. Non la versione da pettegolezzo, con il suo cattivo bello netto e il suo delitto bello netto, ma quella vera. Constance Okafor, una domestica diciannovenne nell'inverno del 1924, non pagata per mesi, con la madre morente a tre isolati di distanza e senza soldi per un medico, a cui era stato detto di essere grata per un tetto mentre spolverava, ogni singolo giorno, una spilla che valeva più di quanto avrebbe guadagnato in tre vite intere. Una ragazza disperata che aveva preso l'unica cosa che riusciva a raggiungere, da una famiglia che l'aveva derubata per prima, e l'aveva trasformata in cento anni di accoglienza sincera per i viaggiatori che passavano da Frost Falls nel freddo.</w:t>
       </w:r>
     </w:p>
     <w:p/>
@@ -4429,7 +4429,7 @@
     <w:p/>
     <w:p>
       <w:r>
-        <w:t>Ma, per lo più, accadde l'altra cosa. La gente cominciò, silenziosamente, di sbieco, come faceva questo paese quando compiva i suoi gesti più profondi, a venire a ringraziarmi. Dot mi mise in mano un barattolo delle sue conserve al mercato e disse, burbera, guardando le mele e non me: «Hai fatto la cosa giusta con Fiona. Molti avrebbero girato la faccia dall'altra parte.» Sam Patel mi accennò un saluto con la tesa del berretto in fondo a Evergreen Avenue. Persino Noriko, che era avara di lodi, mi disse davanti a un caffè che avevo gestito la faccenda meglio della maggior parte dei professionisti con cui aveva lavorato nella sua carriera, che avevo trovato una via calorosa attraverso qualcosa che di solito offre solo vie gelide.</w:t>
+        <w:t xml:space="preserve">Ma, per lo più, accadde l'altra cosa. La gente cominciò, silenziosamente, di sbieco, come faceva questo paese quando compiva i suoi gesti più profondi, a venire a ringraziarmi. Dot mi mise in mano un barattolo delle sue conserve al mercato e disse, burbera, guardando le mele e non me: «Hai fatto la cosa giusta con Fiona. Molti avrebbero girato la faccia dall'altra parte.» Sam Patel mi accennò un saluto con la tesa del berretto dall'altra parte di Evergreen Avenue. Persino Noriko, che era avara di lodi, mi disse davanti a un caffè che avevo gestito la faccenda meglio della maggior parte dei professionisti con cui aveva lavorato nella sua carriera, che avevo trovato una via calorosa attraverso qualcosa che di solito offre solo vie gelide.</w:t>
       </w:r>
     </w:p>
     <w:p/>
@@ -4524,7 +4524,7 @@
     <w:p/>
     <w:p>
       <w:r>
-        <w:t>«Ha trovato metà della strada per arrivarci, dopotutto» continuò Noriko, «anche se è andato a cercarla nel modo sbagliato. Ha dedicato trent'anni a sapere dove si trovano le cose sepolte di questo paese. Dovrebbe esserci per vedere questa che torna alla luce. Potrebbe essere la prima cosa bella vicino a cui gli è concesso di stare. E stare vicino a una cosa bella di cui non può prendersi alcun merito potrebbe essere esattamente la medicina di cui ha bisogno.»</w:t>
+        <w:t xml:space="preserve">«Ha trovato metà della strada per arrivarci, dopotutto» continuò Noriko, «anche se è andato a cercarla nel modo sbagliato. Ha dedicato trent'anni a sapere dove si trovano le cose sepolte di questo paese. Dovrebbe esserci per vedere questa che torna alla luce. Potrebbe essere la prima cosa bella vicino a cui gli è concesso di stare di nuovo. E stare vicino a una cosa bella di cui non può prendersi alcun merito potrebbe essere esattamente la medicina di cui ha bisogno.»</w:t>
       </w:r>
     </w:p>
     <w:p/>
@@ -4943,7 +4943,7 @@
     </w:p>
     <w:p>
       <w:r>
-        <w:t xml:space="preserve">Me ne mise in mano uno prima che potessi chiederlo, e lo stesso fece con Claire, che protestò ma lo prese. Si piantò davanti a Martha finché questa non le promise di mangiare il proprio. E solo quando ne ebbero tutti uno se ne prese uno per sé. Lo mangiò in piedi, guardandoci mentre ce lo gustavamo.</w:t>
+        <w:t xml:space="preserve">Me ne mise in mano uno prima che potessi chiederlo, e lo stesso fece con Claire, che protestò ma lo prese. Si piantò davanti a Martha finché questa non le promise di mangiare il proprio. E solo quando tutte ne ebbero uno, se ne prese uno per sé. Lo mangiò in piedi, guardandoci mentre ce lo gustavamo.</w:t>
       </w:r>
     </w:p>
     <w:p>
@@ -5033,7 +5033,7 @@
     </w:p>
     <w:p>
       <w:r>
-        <w:t>«L'idea di qualcheduno per fare uno scherzo» sentenziò Dot. «L'ha girato nella notte. Ragazzi.»</w:t>
+        <w:t xml:space="preserve">«Lo scherzo di qualcuno» sentenziò Dot. «Girato nella notte. Ragazzi.»</w:t>
       </w:r>
     </w:p>
     <w:p>

</xml_diff>